<commit_message>
Cierra Preguntas Frecuentes y Noticias y Comunicados; agrega index_prueba.html (rediseno experimental) y actualiza bitacora, para revision de Gerardo
</commit_message>
<xml_diff>
--- a/docs/Jeiron-Bitacora.docx
+++ b/docs/Jeiron-Bitacora.docx
@@ -1,6 +1,6 @@
 
 <file path=word/document.xml><?xml version="1.0" encoding="utf-8"?>
-<w:document xmlns:wpc="http://schemas.microsoft.com/office/word/2010/wordprocessingCanvas" xmlns:cx="http://schemas.microsoft.com/office/drawing/2014/chartex" xmlns:cx1="http://schemas.microsoft.com/office/drawing/2015/9/8/chartex" xmlns:cx2="http://schemas.microsoft.com/office/drawing/2015/10/21/chartex" xmlns:cx3="http://schemas.microsoft.com/office/drawing/2016/5/9/chartex" xmlns:cx4="http://schemas.microsoft.com/office/drawing/2016/5/10/chartex" xmlns:cx5="http://schemas.microsoft.com/office/drawing/2016/5/11/chartex" xmlns:cx6="http://schemas.microsoft.com/office/drawing/2016/5/12/chartex" xmlns:cx7="http://schemas.microsoft.com/office/drawing/2016/5/13/chartex" xmlns:cx8="http://schemas.microsoft.com/office/drawing/2016/5/14/chartex" xmlns:mc="http://schemas.openxmlformats.org/markup-compatibility/2006" xmlns:aink="http://schemas.microsoft.com/office/drawing/2016/ink" xmlns:am3d="http://schemas.microsoft.com/office/drawing/2017/model3d" xmlns:o="urn:schemas-microsoft-com:office:office" xmlns:oel="http://schemas.microsoft.com/office/2019/extlst" xmlns:r="http://schemas.openxmlformats.org/officeDocument/2006/relationships" xmlns:m="http://schemas.openxmlformats.org/officeDocument/2006/math" xmlns:v="urn:schemas-microsoft-com:vml" xmlns:wp14="http://schemas.microsoft.com/office/word/2010/wordprocessingDrawing" xmlns:wp="http://schemas.openxmlformats.org/drawingml/2006/wordprocessingDrawing" xmlns:w10="urn:schemas-microsoft-com:office:word" xmlns:w="http://schemas.openxmlformats.org/wordprocessingml/2006/main" xmlns:w14="http://schemas.microsoft.com/office/word/2010/wordml" xmlns:w15="http://schemas.microsoft.com/office/word/2012/wordml" xmlns:w16cei="http://schemas.microsoft.com/office/word/2026/wordml/cei" xmlns:w16cex="http://schemas.microsoft.com/office/word/2018/wordml/cex" xmlns:w16cid="http://schemas.microsoft.com/office/word/2016/wordml/cid" xmlns:w16="http://schemas.microsoft.com/office/word/2018/wordml" xmlns:w16du="http://schemas.microsoft.com/office/word/2023/wordml/word16du" xmlns:w16sdtdh="http://schemas.microsoft.com/office/word/2020/wordml/sdtdatahash" xmlns:w16sdtfl="http://schemas.microsoft.com/office/word/2024/wordml/sdtformatlock" xmlns:w16se="http://schemas.microsoft.com/office/word/2015/wordml/symex" xmlns:wpg="http://schemas.microsoft.com/office/word/2010/wordprocessingGroup" xmlns:wpi="http://schemas.microsoft.com/office/word/2010/wordprocessingInk" xmlns:wne="http://schemas.microsoft.com/office/word/2006/wordml" xmlns:wps="http://schemas.microsoft.com/office/word/2010/wordprocessingShape" mc:Ignorable="w14 w15 w16se w16cid w16 w16cex w16sdtdh w16sdtfl w16du wp14">
+<w:document xmlns:wpc="http://schemas.microsoft.com/office/word/2010/wordprocessingCanvas" xmlns:cx="http://schemas.microsoft.com/office/drawing/2014/chartex" xmlns:cx1="http://schemas.microsoft.com/office/drawing/2015/9/8/chartex" xmlns:cx2="http://schemas.microsoft.com/office/drawing/2015/10/21/chartex" xmlns:cx3="http://schemas.microsoft.com/office/drawing/2016/5/9/chartex" xmlns:cx4="http://schemas.microsoft.com/office/drawing/2016/5/10/chartex" xmlns:cx5="http://schemas.microsoft.com/office/drawing/2016/5/11/chartex" xmlns:cx6="http://schemas.microsoft.com/office/drawing/2016/5/12/chartex" xmlns:cx7="http://schemas.microsoft.com/office/drawing/2016/5/13/chartex" xmlns:cx8="http://schemas.microsoft.com/office/drawing/2016/5/14/chartex" xmlns:mc="http://schemas.openxmlformats.org/markup-compatibility/2006" xmlns:aink="http://schemas.microsoft.com/office/drawing/2016/ink" xmlns:am3d="http://schemas.microsoft.com/office/drawing/2017/model3d" xmlns:o="urn:schemas-microsoft-com:office:office" xmlns:r="http://schemas.openxmlformats.org/officeDocument/2006/relationships" xmlns:m="http://schemas.openxmlformats.org/officeDocument/2006/math" xmlns:v="urn:schemas-microsoft-com:vml" xmlns:wp14="http://schemas.microsoft.com/office/word/2010/wordprocessingDrawing" xmlns:wp="http://schemas.openxmlformats.org/drawingml/2006/wordprocessingDrawing" xmlns:w10="urn:schemas-microsoft-com:office:word" xmlns:w="http://schemas.openxmlformats.org/wordprocessingml/2006/main" xmlns:w14="http://schemas.microsoft.com/office/word/2010/wordml" xmlns:w15="http://schemas.microsoft.com/office/word/2012/wordml" xmlns:w16cex="http://schemas.microsoft.com/office/word/2018/wordml/cex" xmlns:w16cid="http://schemas.microsoft.com/office/word/2016/wordml/cid" xmlns:w16="http://schemas.microsoft.com/office/word/2018/wordml" xmlns:w16sdtdh="http://schemas.microsoft.com/office/word/2020/wordml/sdtdatahash" xmlns:w16se="http://schemas.microsoft.com/office/word/2015/wordml/symex" xmlns:wpg="http://schemas.microsoft.com/office/word/2010/wordprocessingGroup" xmlns:wpi="http://schemas.microsoft.com/office/word/2010/wordprocessingInk" xmlns:wne="http://schemas.microsoft.com/office/word/2006/wordml" xmlns:wps="http://schemas.microsoft.com/office/word/2010/wordprocessingShape" mc:Ignorable="w14 w15 w16se w16cid w16 w16cex w16sdtdh wp14">
   <w:body>
     <w:p>
       <w:pPr>
@@ -14,23 +14,7 @@
           <w:b/>
           <w:bCs/>
         </w:rPr>
-        <w:t xml:space="preserve">Pasantía: </w:t>
-      </w:r>
-      <w:proofErr w:type="spellStart"/>
-      <w:r>
-        <w:rPr>
-          <w:b/>
-          <w:bCs/>
-        </w:rPr>
-        <w:t>Jeiron</w:t>
-      </w:r>
-      <w:proofErr w:type="spellEnd"/>
-      <w:r>
-        <w:rPr>
-          <w:b/>
-          <w:bCs/>
-        </w:rPr>
-        <w:t xml:space="preserve"> Arroyo Brenes</w:t>
+        <w:t>Pasantía: Jeiron Arroyo Brenes</w:t>
       </w:r>
     </w:p>
     <w:p>
@@ -225,6 +209,104 @@
             <w:r>
               <w:t>Repaso de en qué consiste el proyecto</w:t>
             </w:r>
+            <w:r>
+              <w:t xml:space="preserve">. </w:t>
+            </w:r>
+          </w:p>
+          <w:p/>
+          <w:p>
+            <w:r>
+              <w:t xml:space="preserve">Revisión del </w:t>
+            </w:r>
+            <w:proofErr w:type="spellStart"/>
+            <w:r>
+              <w:t>stack</w:t>
+            </w:r>
+            <w:proofErr w:type="spellEnd"/>
+            <w:r>
+              <w:t xml:space="preserve"> de herramientas y software a utilizar (Claude, Render, GitHub, </w:t>
+            </w:r>
+            <w:proofErr w:type="spellStart"/>
+            <w:r>
+              <w:t>Phyton</w:t>
+            </w:r>
+            <w:proofErr w:type="spellEnd"/>
+          </w:p>
+          <w:p/>
+          <w:p>
+            <w:r>
+              <w:t>Definición del mecanismo de comunicación con el tutor por parte de la empresa</w:t>
+            </w:r>
+          </w:p>
+          <w:p/>
+          <w:p>
+            <w:r>
+              <w:t>Compartir repositorios de GitHub con el tutor y configuración de los mecanismos de sincronización</w:t>
+            </w:r>
+          </w:p>
+          <w:p/>
+          <w:p>
+            <w:r>
+              <w:t xml:space="preserve">Repaso de cómo se hace con Claude como coordinador, para hacer </w:t>
+            </w:r>
+            <w:proofErr w:type="spellStart"/>
+            <w:r>
+              <w:t>scrapping</w:t>
+            </w:r>
+            <w:proofErr w:type="spellEnd"/>
+            <w:r>
+              <w:t xml:space="preserve"> del sitio WEB real de la Municipalidad usando </w:t>
+            </w:r>
+            <w:proofErr w:type="spellStart"/>
+            <w:r>
+              <w:t>Selenium</w:t>
+            </w:r>
+            <w:proofErr w:type="spellEnd"/>
+            <w:r>
+              <w:t xml:space="preserve"> y generación de un clone del mismo además del </w:t>
+            </w:r>
+            <w:proofErr w:type="spellStart"/>
+            <w:r>
+              <w:t>chatbo</w:t>
+            </w:r>
+            <w:r>
+              <w:t>t</w:t>
+            </w:r>
+            <w:proofErr w:type="spellEnd"/>
+          </w:p>
+          <w:p/>
+          <w:p>
+            <w:r>
+              <w:t xml:space="preserve">Repaso de la configuración en Render para hacer el despliegue del APP y las páginas en GitHub </w:t>
+            </w:r>
+            <w:proofErr w:type="spellStart"/>
+            <w:r>
+              <w:t>pages</w:t>
+            </w:r>
+            <w:proofErr w:type="spellEnd"/>
+          </w:p>
+          <w:p>
+            <w:r>
+              <w:t>Inicio del trabajo de revisión comparando cada opción del prototipo generado con el sitio real para poco a poco ir alineando detalles en coordinación con Claude</w:t>
+            </w:r>
+          </w:p>
+          <w:p/>
+          <w:p>
+            <w:r>
+              <w:t>Arreglé que el link de “Solicitud de Artesanos” no abría.</w:t>
+            </w:r>
+          </w:p>
+          <w:p/>
+          <w:p>
+            <w:r>
+              <w:t>Acabé el arreglo pendiente de “Plan Regulado de Flores”</w:t>
+            </w:r>
+          </w:p>
+          <w:p/>
+          <w:p>
+            <w:r>
+              <w:t>Revisión de “Formularios” y “Trámites”</w:t>
+            </w:r>
           </w:p>
           <w:p/>
         </w:tc>
@@ -234,49 +316,253 @@
           <w:tcPr>
             <w:tcW w:w="913" w:type="dxa"/>
           </w:tcPr>
-          <w:p/>
+          <w:p>
+            <w:r>
+              <w:t>4</w:t>
+            </w:r>
+            <w:r>
+              <w:t>/8/26</w:t>
+            </w:r>
+          </w:p>
         </w:tc>
         <w:tc>
           <w:tcPr>
             <w:tcW w:w="1074" w:type="dxa"/>
           </w:tcPr>
-          <w:p/>
+          <w:p>
+            <w:r>
+              <w:t>08 AM</w:t>
+            </w:r>
+          </w:p>
         </w:tc>
         <w:tc>
           <w:tcPr>
             <w:tcW w:w="904" w:type="dxa"/>
           </w:tcPr>
-          <w:p/>
+          <w:p>
+            <w:r>
+              <w:t>5PM</w:t>
+            </w:r>
+          </w:p>
         </w:tc>
         <w:tc>
           <w:tcPr>
             <w:tcW w:w="812" w:type="dxa"/>
           </w:tcPr>
-          <w:p/>
+          <w:p>
+            <w:r>
+              <w:t>8</w:t>
+            </w:r>
+          </w:p>
         </w:tc>
         <w:tc>
           <w:tcPr>
             <w:tcW w:w="5125" w:type="dxa"/>
           </w:tcPr>
           <w:p>
-            <w:r>
-              <w:t xml:space="preserve">Revisión del </w:t>
+            <w:pPr>
+              <w:pStyle w:val="font-claude-response-body"/>
+              <w:rPr>
+                <w:rFonts w:asciiTheme="minorHAnsi" w:eastAsiaTheme="minorHAnsi" w:hAnsiTheme="minorHAnsi" w:cstheme="minorBidi"/>
+                <w:kern w:val="2"/>
+                <w:sz w:val="22"/>
+                <w:szCs w:val="22"/>
+                <w:lang w:eastAsia="en-US"/>
+                <w14:ligatures w14:val="standardContextual"/>
+              </w:rPr>
+            </w:pPr>
+            <w:r>
+              <w:rPr>
+                <w:rFonts w:asciiTheme="minorHAnsi" w:eastAsiaTheme="minorHAnsi" w:hAnsiTheme="minorHAnsi" w:cstheme="minorBidi"/>
+                <w:kern w:val="2"/>
+                <w:sz w:val="22"/>
+                <w:szCs w:val="22"/>
+                <w:lang w:eastAsia="en-US"/>
+                <w14:ligatures w14:val="standardContextual"/>
+              </w:rPr>
+              <w:t xml:space="preserve">Se subieron 3 </w:t>
             </w:r>
             <w:proofErr w:type="spellStart"/>
             <w:r>
-              <w:t>stack</w:t>
+              <w:rPr>
+                <w:rFonts w:asciiTheme="minorHAnsi" w:eastAsiaTheme="minorHAnsi" w:hAnsiTheme="minorHAnsi" w:cstheme="minorBidi"/>
+                <w:kern w:val="2"/>
+                <w:sz w:val="22"/>
+                <w:szCs w:val="22"/>
+                <w:lang w:eastAsia="en-US"/>
+                <w14:ligatures w14:val="standardContextual"/>
+              </w:rPr>
+              <w:t>PDFs</w:t>
             </w:r>
             <w:proofErr w:type="spellEnd"/>
             <w:r>
-              <w:t xml:space="preserve"> de herramientas y software a utilizar (Claude, Render, GitHub, </w:t>
+              <w:rPr>
+                <w:rFonts w:asciiTheme="minorHAnsi" w:eastAsiaTheme="minorHAnsi" w:hAnsiTheme="minorHAnsi" w:cstheme="minorBidi"/>
+                <w:kern w:val="2"/>
+                <w:sz w:val="22"/>
+                <w:szCs w:val="22"/>
+                <w:lang w:eastAsia="en-US"/>
+                <w14:ligatures w14:val="standardContextual"/>
+              </w:rPr>
+              <w:t xml:space="preserve"> propios al repositorio (Mapa de Zonificación, Amnistía Tributaria, Plan de Desarrollo Humano Local), reemplazando enlaces frágiles a Dropbox.</w:t>
+            </w:r>
+            <w:r>
+              <w:rPr>
+                <w:rFonts w:asciiTheme="minorHAnsi" w:eastAsiaTheme="minorHAnsi" w:hAnsiTheme="minorHAnsi" w:cstheme="minorBidi"/>
+                <w:kern w:val="2"/>
+                <w:sz w:val="22"/>
+                <w:szCs w:val="22"/>
+                <w:lang w:eastAsia="en-US"/>
+                <w14:ligatures w14:val="standardContextual"/>
+              </w:rPr>
+              <w:t xml:space="preserve"> </w:t>
+            </w:r>
+          </w:p>
+          <w:p>
+            <w:pPr>
+              <w:pStyle w:val="font-claude-response-body"/>
+              <w:rPr>
+                <w:rFonts w:asciiTheme="minorHAnsi" w:eastAsiaTheme="minorHAnsi" w:hAnsiTheme="minorHAnsi" w:cstheme="minorBidi"/>
+                <w:kern w:val="2"/>
+                <w:sz w:val="22"/>
+                <w:szCs w:val="22"/>
+                <w:lang w:eastAsia="en-US"/>
+                <w14:ligatures w14:val="standardContextual"/>
+              </w:rPr>
+            </w:pPr>
+            <w:r>
+              <w:rPr>
+                <w:rFonts w:asciiTheme="minorHAnsi" w:eastAsiaTheme="minorHAnsi" w:hAnsiTheme="minorHAnsi" w:cstheme="minorBidi"/>
+                <w:kern w:val="2"/>
+                <w:sz w:val="22"/>
+                <w:szCs w:val="22"/>
+                <w:lang w:eastAsia="en-US"/>
+                <w14:ligatures w14:val="standardContextual"/>
+              </w:rPr>
+              <w:t>Se resolvió "Plan de Desarrollo Urbano Cantonal": era el mismo documento que Plan de Desarrollo Humano Local, solo con otra etiqueta en el sitio real. Ya no figura como enlace roto.</w:t>
+            </w:r>
+          </w:p>
+          <w:p>
+            <w:pPr>
+              <w:pStyle w:val="font-claude-response-body"/>
+              <w:rPr>
+                <w:rFonts w:asciiTheme="minorHAnsi" w:eastAsiaTheme="minorHAnsi" w:hAnsiTheme="minorHAnsi" w:cstheme="minorBidi"/>
+                <w:kern w:val="2"/>
+                <w:sz w:val="22"/>
+                <w:szCs w:val="22"/>
+                <w:lang w:eastAsia="en-US"/>
+                <w14:ligatures w14:val="standardContextual"/>
+              </w:rPr>
+            </w:pPr>
+            <w:r>
+              <w:rPr>
+                <w:rFonts w:asciiTheme="minorHAnsi" w:eastAsiaTheme="minorHAnsi" w:hAnsiTheme="minorHAnsi" w:cstheme="minorBidi"/>
+                <w:kern w:val="2"/>
+                <w:sz w:val="22"/>
+                <w:szCs w:val="22"/>
+                <w:lang w:eastAsia="en-US"/>
+                <w14:ligatures w14:val="standardContextual"/>
+              </w:rPr>
+              <w:lastRenderedPageBreak/>
+              <w:t>Se agregó el botón "Ver en el sitio real" a varias secciones que no lo tenían.</w:t>
+            </w:r>
+          </w:p>
+          <w:p>
+            <w:pPr>
+              <w:pStyle w:val="font-claude-response-body"/>
+              <w:rPr>
+                <w:rFonts w:asciiTheme="minorHAnsi" w:eastAsiaTheme="minorHAnsi" w:hAnsiTheme="minorHAnsi" w:cstheme="minorBidi"/>
+                <w:kern w:val="2"/>
+                <w:sz w:val="22"/>
+                <w:szCs w:val="22"/>
+                <w:lang w:eastAsia="en-US"/>
+                <w14:ligatures w14:val="standardContextual"/>
+              </w:rPr>
+            </w:pPr>
+            <w:r>
+              <w:rPr>
+                <w:rFonts w:asciiTheme="minorHAnsi" w:eastAsiaTheme="minorHAnsi" w:hAnsiTheme="minorHAnsi" w:cstheme="minorBidi"/>
+                <w:kern w:val="2"/>
+                <w:sz w:val="22"/>
+                <w:szCs w:val="22"/>
+                <w:lang w:eastAsia="en-US"/>
+                <w14:ligatures w14:val="standardContextual"/>
+              </w:rPr>
+              <w:t xml:space="preserve">Se corrigió el mensaje de páginas "externas": ahora distingue entre páginas que sí son del sitio real de la Municipalidad y sistemas realmente ajenos (CFIA, Google </w:t>
             </w:r>
             <w:proofErr w:type="spellStart"/>
             <w:r>
-              <w:t>Phyton</w:t>
+              <w:rPr>
+                <w:rFonts w:asciiTheme="minorHAnsi" w:eastAsiaTheme="minorHAnsi" w:hAnsiTheme="minorHAnsi" w:cstheme="minorBidi"/>
+                <w:kern w:val="2"/>
+                <w:sz w:val="22"/>
+                <w:szCs w:val="22"/>
+                <w:lang w:eastAsia="en-US"/>
+                <w14:ligatures w14:val="standardContextual"/>
+              </w:rPr>
+              <w:t>Maps</w:t>
             </w:r>
             <w:proofErr w:type="spellEnd"/>
+            <w:r>
+              <w:rPr>
+                <w:rFonts w:asciiTheme="minorHAnsi" w:eastAsiaTheme="minorHAnsi" w:hAnsiTheme="minorHAnsi" w:cstheme="minorBidi"/>
+                <w:kern w:val="2"/>
+                <w:sz w:val="22"/>
+                <w:szCs w:val="22"/>
+                <w:lang w:eastAsia="en-US"/>
+                <w14:ligatures w14:val="standardContextual"/>
+              </w:rPr>
+              <w:t>, Contraloría).</w:t>
+            </w:r>
           </w:p>
-          <w:p/>
+          <w:p>
+            <w:pPr>
+              <w:pStyle w:val="font-claude-response-body"/>
+              <w:rPr>
+                <w:rFonts w:asciiTheme="minorHAnsi" w:eastAsiaTheme="minorHAnsi" w:hAnsiTheme="minorHAnsi" w:cstheme="minorBidi"/>
+                <w:kern w:val="2"/>
+                <w:sz w:val="22"/>
+                <w:szCs w:val="22"/>
+                <w:lang w:eastAsia="en-US"/>
+                <w14:ligatures w14:val="standardContextual"/>
+              </w:rPr>
+            </w:pPr>
+            <w:r>
+              <w:rPr>
+                <w:rFonts w:asciiTheme="minorHAnsi" w:eastAsiaTheme="minorHAnsi" w:hAnsiTheme="minorHAnsi" w:cstheme="minorBidi"/>
+                <w:kern w:val="2"/>
+                <w:sz w:val="22"/>
+                <w:szCs w:val="22"/>
+                <w:lang w:eastAsia="en-US"/>
+                <w14:ligatures w14:val="standardContextual"/>
+              </w:rPr>
+              <w:t>Se simplificó la sección Transparencia a un solo enlace directo al sitio real.</w:t>
+            </w:r>
+          </w:p>
+          <w:p>
+            <w:pPr>
+              <w:pStyle w:val="font-claude-response-body"/>
+              <w:rPr>
+                <w:rFonts w:asciiTheme="minorHAnsi" w:eastAsiaTheme="minorHAnsi" w:hAnsiTheme="minorHAnsi" w:cstheme="minorBidi"/>
+                <w:kern w:val="2"/>
+                <w:sz w:val="22"/>
+                <w:szCs w:val="22"/>
+                <w:lang w:eastAsia="en-US"/>
+                <w14:ligatures w14:val="standardContextual"/>
+              </w:rPr>
+            </w:pPr>
+            <w:r>
+              <w:rPr>
+                <w:rFonts w:asciiTheme="minorHAnsi" w:eastAsiaTheme="minorHAnsi" w:hAnsiTheme="minorHAnsi" w:cstheme="minorBidi"/>
+                <w:kern w:val="2"/>
+                <w:sz w:val="22"/>
+                <w:szCs w:val="22"/>
+                <w:lang w:eastAsia="en-US"/>
+                <w14:ligatures w14:val="standardContextual"/>
+              </w:rPr>
+              <w:t>Contribuyente queda prácticamente cerrado; solo falta "Preguntas Frecuentes" (ya identificadas sus 6 categorías para la próxima sesión).</w:t>
+            </w:r>
+          </w:p>
         </w:tc>
       </w:tr>
       <w:tr>
@@ -284,35 +570,50 @@
           <w:tcPr>
             <w:tcW w:w="913" w:type="dxa"/>
           </w:tcPr>
-          <w:p/>
+          <w:p>
+            <w:r>
+              <w:lastRenderedPageBreak/>
+              <w:t>5</w:t>
+            </w:r>
+            <w:r>
+              <w:t>/8/26</w:t>
+            </w:r>
+          </w:p>
         </w:tc>
         <w:tc>
           <w:tcPr>
             <w:tcW w:w="1074" w:type="dxa"/>
           </w:tcPr>
-          <w:p/>
+          <w:p>
+            <w:r>
+              <w:t>08 AM</w:t>
+            </w:r>
+          </w:p>
         </w:tc>
         <w:tc>
           <w:tcPr>
             <w:tcW w:w="904" w:type="dxa"/>
           </w:tcPr>
-          <w:p/>
+          <w:p>
+            <w:r>
+              <w:t>5PM</w:t>
+            </w:r>
+          </w:p>
         </w:tc>
         <w:tc>
           <w:tcPr>
             <w:tcW w:w="812" w:type="dxa"/>
           </w:tcPr>
-          <w:p/>
+          <w:p>
+            <w:r>
+              <w:t>8</w:t>
+            </w:r>
+          </w:p>
         </w:tc>
         <w:tc>
           <w:tcPr>
             <w:tcW w:w="5125" w:type="dxa"/>
           </w:tcPr>
-          <w:p>
-            <w:r>
-              <w:t>Definición del mecanismo de comunicación con el tutor por parte de la empresa</w:t>
-            </w:r>
-          </w:p>
           <w:p/>
         </w:tc>
       </w:tr>
@@ -345,14 +646,6 @@
           <w:tcPr>
             <w:tcW w:w="5125" w:type="dxa"/>
           </w:tcPr>
-          <w:p>
-            <w:r>
-              <w:t>Compartir repositorios de GitHub con el tutor y configuración de los mecanismos</w:t>
-            </w:r>
-            <w:r>
-              <w:t xml:space="preserve"> de sincronización</w:t>
-            </w:r>
-          </w:p>
           <w:p/>
         </w:tc>
       </w:tr>
@@ -385,62 +678,6 @@
           <w:tcPr>
             <w:tcW w:w="5125" w:type="dxa"/>
           </w:tcPr>
-          <w:p>
-            <w:r>
-              <w:t xml:space="preserve">Repaso de cómo se hace </w:t>
-            </w:r>
-            <w:r>
-              <w:t xml:space="preserve">con </w:t>
-            </w:r>
-            <w:r>
-              <w:t xml:space="preserve">Claude </w:t>
-            </w:r>
-            <w:r>
-              <w:t>como coordinador</w:t>
-            </w:r>
-            <w:r>
-              <w:t>,</w:t>
-            </w:r>
-            <w:r>
-              <w:t xml:space="preserve"> pa</w:t>
-            </w:r>
-            <w:r>
-              <w:t xml:space="preserve">ra hacer </w:t>
-            </w:r>
-            <w:proofErr w:type="spellStart"/>
-            <w:r>
-              <w:t>scrapping</w:t>
-            </w:r>
-            <w:proofErr w:type="spellEnd"/>
-            <w:r>
-              <w:t xml:space="preserve"> del sitio WEB real de la Municipalidad</w:t>
-            </w:r>
-            <w:r>
-              <w:t xml:space="preserve"> </w:t>
-            </w:r>
-            <w:r>
-              <w:t xml:space="preserve">usando </w:t>
-            </w:r>
-            <w:proofErr w:type="spellStart"/>
-            <w:r>
-              <w:t>Selenium</w:t>
-            </w:r>
-            <w:proofErr w:type="spellEnd"/>
-            <w:r>
-              <w:t xml:space="preserve"> </w:t>
-            </w:r>
-            <w:r>
-              <w:t xml:space="preserve">y generación de un clone </w:t>
-            </w:r>
-            <w:r>
-              <w:t xml:space="preserve">del mismo además del </w:t>
-            </w:r>
-            <w:proofErr w:type="spellStart"/>
-            <w:r>
-              <w:t>chatbot</w:t>
-            </w:r>
-            <w:proofErr w:type="spellEnd"/>
-          </w:p>
           <w:p/>
         </w:tc>
       </w:tr>
@@ -473,22 +710,6 @@
           <w:tcPr>
             <w:tcW w:w="5125" w:type="dxa"/>
           </w:tcPr>
-          <w:p>
-            <w:r>
-              <w:t xml:space="preserve">Repaso de la configuración </w:t>
-            </w:r>
-            <w:r>
-              <w:t xml:space="preserve">en Render para hacer el despliegue del APP y </w:t>
-            </w:r>
-            <w:r>
-              <w:t xml:space="preserve">las páginas en GitHub </w:t>
-            </w:r>
-            <w:proofErr w:type="spellStart"/>
-            <w:r>
-              <w:t>pages</w:t>
-            </w:r>
-            <w:proofErr w:type="spellEnd"/>
-          </w:p>
           <w:p/>
         </w:tc>
       </w:tr>
@@ -521,14 +742,6 @@
           <w:tcPr>
             <w:tcW w:w="5125" w:type="dxa"/>
           </w:tcPr>
-          <w:p>
-            <w:r>
-              <w:t xml:space="preserve">Inicio del trabajo de revisión comparando cada opción del prototipo generado </w:t>
-            </w:r>
-            <w:r>
-              <w:t>con el sitio real para poco a poco ir alineando detalles en coordinación con Claude</w:t>
-            </w:r>
-          </w:p>
           <w:p/>
         </w:tc>
       </w:tr>
@@ -930,7 +1143,7 @@
 </file>
 
 <file path=word/endnotes.xml><?xml version="1.0" encoding="utf-8"?>
-<w:endnotes xmlns:wpc="http://schemas.microsoft.com/office/word/2010/wordprocessingCanvas" xmlns:cx="http://schemas.microsoft.com/office/drawing/2014/chartex" xmlns:cx1="http://schemas.microsoft.com/office/drawing/2015/9/8/chartex" xmlns:cx2="http://schemas.microsoft.com/office/drawing/2015/10/21/chartex" xmlns:cx3="http://schemas.microsoft.com/office/drawing/2016/5/9/chartex" xmlns:cx4="http://schemas.microsoft.com/office/drawing/2016/5/10/chartex" xmlns:cx5="http://schemas.microsoft.com/office/drawing/2016/5/11/chartex" xmlns:cx6="http://schemas.microsoft.com/office/drawing/2016/5/12/chartex" xmlns:cx7="http://schemas.microsoft.com/office/drawing/2016/5/13/chartex" xmlns:cx8="http://schemas.microsoft.com/office/drawing/2016/5/14/chartex" xmlns:mc="http://schemas.openxmlformats.org/markup-compatibility/2006" xmlns:aink="http://schemas.microsoft.com/office/drawing/2016/ink" xmlns:am3d="http://schemas.microsoft.com/office/drawing/2017/model3d" xmlns:o="urn:schemas-microsoft-com:office:office" xmlns:oel="http://schemas.microsoft.com/office/2019/extlst" xmlns:r="http://schemas.openxmlformats.org/officeDocument/2006/relationships" xmlns:m="http://schemas.openxmlformats.org/officeDocument/2006/math" xmlns:v="urn:schemas-microsoft-com:vml" xmlns:wp14="http://schemas.microsoft.com/office/word/2010/wordprocessingDrawing" xmlns:wp="http://schemas.openxmlformats.org/drawingml/2006/wordprocessingDrawing" xmlns:w10="urn:schemas-microsoft-com:office:word" xmlns:w="http://schemas.openxmlformats.org/wordprocessingml/2006/main" xmlns:w14="http://schemas.microsoft.com/office/word/2010/wordml" xmlns:w15="http://schemas.microsoft.com/office/word/2012/wordml" xmlns:w16cei="http://schemas.microsoft.com/office/word/2026/wordml/cei" xmlns:w16cex="http://schemas.microsoft.com/office/word/2018/wordml/cex" xmlns:w16cid="http://schemas.microsoft.com/office/word/2016/wordml/cid" xmlns:w16="http://schemas.microsoft.com/office/word/2018/wordml" xmlns:w16du="http://schemas.microsoft.com/office/word/2023/wordml/word16du" xmlns:w16sdtdh="http://schemas.microsoft.com/office/word/2020/wordml/sdtdatahash" xmlns:w16sdtfl="http://schemas.microsoft.com/office/word/2024/wordml/sdtformatlock" xmlns:w16se="http://schemas.microsoft.com/office/word/2015/wordml/symex" xmlns:wpg="http://schemas.microsoft.com/office/word/2010/wordprocessingGroup" xmlns:wpi="http://schemas.microsoft.com/office/word/2010/wordprocessingInk" xmlns:wne="http://schemas.microsoft.com/office/word/2006/wordml" xmlns:wps="http://schemas.microsoft.com/office/word/2010/wordprocessingShape" mc:Ignorable="w14 w15 w16se w16cid w16 w16cex w16sdtdh w16sdtfl w16du wp14">
+<w:endnotes xmlns:wpc="http://schemas.microsoft.com/office/word/2010/wordprocessingCanvas" xmlns:cx="http://schemas.microsoft.com/office/drawing/2014/chartex" xmlns:cx1="http://schemas.microsoft.com/office/drawing/2015/9/8/chartex" xmlns:cx2="http://schemas.microsoft.com/office/drawing/2015/10/21/chartex" xmlns:cx3="http://schemas.microsoft.com/office/drawing/2016/5/9/chartex" xmlns:cx4="http://schemas.microsoft.com/office/drawing/2016/5/10/chartex" xmlns:cx5="http://schemas.microsoft.com/office/drawing/2016/5/11/chartex" xmlns:cx6="http://schemas.microsoft.com/office/drawing/2016/5/12/chartex" xmlns:cx7="http://schemas.microsoft.com/office/drawing/2016/5/13/chartex" xmlns:cx8="http://schemas.microsoft.com/office/drawing/2016/5/14/chartex" xmlns:mc="http://schemas.openxmlformats.org/markup-compatibility/2006" xmlns:aink="http://schemas.microsoft.com/office/drawing/2016/ink" xmlns:am3d="http://schemas.microsoft.com/office/drawing/2017/model3d" xmlns:o="urn:schemas-microsoft-com:office:office" xmlns:r="http://schemas.openxmlformats.org/officeDocument/2006/relationships" xmlns:m="http://schemas.openxmlformats.org/officeDocument/2006/math" xmlns:v="urn:schemas-microsoft-com:vml" xmlns:wp14="http://schemas.microsoft.com/office/word/2010/wordprocessingDrawing" xmlns:wp="http://schemas.openxmlformats.org/drawingml/2006/wordprocessingDrawing" xmlns:w10="urn:schemas-microsoft-com:office:word" xmlns:w="http://schemas.openxmlformats.org/wordprocessingml/2006/main" xmlns:w14="http://schemas.microsoft.com/office/word/2010/wordml" xmlns:w15="http://schemas.microsoft.com/office/word/2012/wordml" xmlns:w16cex="http://schemas.microsoft.com/office/word/2018/wordml/cex" xmlns:w16cid="http://schemas.microsoft.com/office/word/2016/wordml/cid" xmlns:w16="http://schemas.microsoft.com/office/word/2018/wordml" xmlns:w16sdtdh="http://schemas.microsoft.com/office/word/2020/wordml/sdtdatahash" xmlns:w16se="http://schemas.microsoft.com/office/word/2015/wordml/symex" xmlns:wpg="http://schemas.microsoft.com/office/word/2010/wordprocessingGroup" xmlns:wpi="http://schemas.microsoft.com/office/word/2010/wordprocessingInk" xmlns:wne="http://schemas.microsoft.com/office/word/2006/wordml" xmlns:wps="http://schemas.microsoft.com/office/word/2010/wordprocessingShape" mc:Ignorable="w14 w15 w16se w16cid w16 w16cex w16sdtdh wp14">
   <w:endnote w:type="separator" w:id="-1">
     <w:p>
       <w:pPr>
@@ -955,7 +1168,7 @@
 </file>
 
 <file path=word/footnotes.xml><?xml version="1.0" encoding="utf-8"?>
-<w:footnotes xmlns:wpc="http://schemas.microsoft.com/office/word/2010/wordprocessingCanvas" xmlns:cx="http://schemas.microsoft.com/office/drawing/2014/chartex" xmlns:cx1="http://schemas.microsoft.com/office/drawing/2015/9/8/chartex" xmlns:cx2="http://schemas.microsoft.com/office/drawing/2015/10/21/chartex" xmlns:cx3="http://schemas.microsoft.com/office/drawing/2016/5/9/chartex" xmlns:cx4="http://schemas.microsoft.com/office/drawing/2016/5/10/chartex" xmlns:cx5="http://schemas.microsoft.com/office/drawing/2016/5/11/chartex" xmlns:cx6="http://schemas.microsoft.com/office/drawing/2016/5/12/chartex" xmlns:cx7="http://schemas.microsoft.com/office/drawing/2016/5/13/chartex" xmlns:cx8="http://schemas.microsoft.com/office/drawing/2016/5/14/chartex" xmlns:mc="http://schemas.openxmlformats.org/markup-compatibility/2006" xmlns:aink="http://schemas.microsoft.com/office/drawing/2016/ink" xmlns:am3d="http://schemas.microsoft.com/office/drawing/2017/model3d" xmlns:o="urn:schemas-microsoft-com:office:office" xmlns:oel="http://schemas.microsoft.com/office/2019/extlst" xmlns:r="http://schemas.openxmlformats.org/officeDocument/2006/relationships" xmlns:m="http://schemas.openxmlformats.org/officeDocument/2006/math" xmlns:v="urn:schemas-microsoft-com:vml" xmlns:wp14="http://schemas.microsoft.com/office/word/2010/wordprocessingDrawing" xmlns:wp="http://schemas.openxmlformats.org/drawingml/2006/wordprocessingDrawing" xmlns:w10="urn:schemas-microsoft-com:office:word" xmlns:w="http://schemas.openxmlformats.org/wordprocessingml/2006/main" xmlns:w14="http://schemas.microsoft.com/office/word/2010/wordml" xmlns:w15="http://schemas.microsoft.com/office/word/2012/wordml" xmlns:w16cei="http://schemas.microsoft.com/office/word/2026/wordml/cei" xmlns:w16cex="http://schemas.microsoft.com/office/word/2018/wordml/cex" xmlns:w16cid="http://schemas.microsoft.com/office/word/2016/wordml/cid" xmlns:w16="http://schemas.microsoft.com/office/word/2018/wordml" xmlns:w16du="http://schemas.microsoft.com/office/word/2023/wordml/word16du" xmlns:w16sdtdh="http://schemas.microsoft.com/office/word/2020/wordml/sdtdatahash" xmlns:w16sdtfl="http://schemas.microsoft.com/office/word/2024/wordml/sdtformatlock" xmlns:w16se="http://schemas.microsoft.com/office/word/2015/wordml/symex" xmlns:wpg="http://schemas.microsoft.com/office/word/2010/wordprocessingGroup" xmlns:wpi="http://schemas.microsoft.com/office/word/2010/wordprocessingInk" xmlns:wne="http://schemas.microsoft.com/office/word/2006/wordml" xmlns:wps="http://schemas.microsoft.com/office/word/2010/wordprocessingShape" mc:Ignorable="w14 w15 w16se w16cid w16 w16cex w16sdtdh w16sdtfl w16du wp14">
+<w:footnotes xmlns:wpc="http://schemas.microsoft.com/office/word/2010/wordprocessingCanvas" xmlns:cx="http://schemas.microsoft.com/office/drawing/2014/chartex" xmlns:cx1="http://schemas.microsoft.com/office/drawing/2015/9/8/chartex" xmlns:cx2="http://schemas.microsoft.com/office/drawing/2015/10/21/chartex" xmlns:cx3="http://schemas.microsoft.com/office/drawing/2016/5/9/chartex" xmlns:cx4="http://schemas.microsoft.com/office/drawing/2016/5/10/chartex" xmlns:cx5="http://schemas.microsoft.com/office/drawing/2016/5/11/chartex" xmlns:cx6="http://schemas.microsoft.com/office/drawing/2016/5/12/chartex" xmlns:cx7="http://schemas.microsoft.com/office/drawing/2016/5/13/chartex" xmlns:cx8="http://schemas.microsoft.com/office/drawing/2016/5/14/chartex" xmlns:mc="http://schemas.openxmlformats.org/markup-compatibility/2006" xmlns:aink="http://schemas.microsoft.com/office/drawing/2016/ink" xmlns:am3d="http://schemas.microsoft.com/office/drawing/2017/model3d" xmlns:o="urn:schemas-microsoft-com:office:office" xmlns:r="http://schemas.openxmlformats.org/officeDocument/2006/relationships" xmlns:m="http://schemas.openxmlformats.org/officeDocument/2006/math" xmlns:v="urn:schemas-microsoft-com:vml" xmlns:wp14="http://schemas.microsoft.com/office/word/2010/wordprocessingDrawing" xmlns:wp="http://schemas.openxmlformats.org/drawingml/2006/wordprocessingDrawing" xmlns:w10="urn:schemas-microsoft-com:office:word" xmlns:w="http://schemas.openxmlformats.org/wordprocessingml/2006/main" xmlns:w14="http://schemas.microsoft.com/office/word/2010/wordml" xmlns:w15="http://schemas.microsoft.com/office/word/2012/wordml" xmlns:w16cex="http://schemas.microsoft.com/office/word/2018/wordml/cex" xmlns:w16cid="http://schemas.microsoft.com/office/word/2016/wordml/cid" xmlns:w16="http://schemas.microsoft.com/office/word/2018/wordml" xmlns:w16sdtdh="http://schemas.microsoft.com/office/word/2020/wordml/sdtdatahash" xmlns:w16se="http://schemas.microsoft.com/office/word/2015/wordml/symex" xmlns:wpg="http://schemas.microsoft.com/office/word/2010/wordprocessingGroup" xmlns:wpi="http://schemas.microsoft.com/office/word/2010/wordprocessingInk" xmlns:wne="http://schemas.microsoft.com/office/word/2006/wordml" xmlns:wps="http://schemas.microsoft.com/office/word/2010/wordprocessingShape" mc:Ignorable="w14 w15 w16se w16cid w16 w16cex w16sdtdh wp14">
   <w:footnote w:type="separator" w:id="-1">
     <w:p>
       <w:pPr>
@@ -980,16 +1193,103 @@
 </file>
 
 <file path=word/header1.xml><?xml version="1.0" encoding="utf-8"?>
-<w:hdr xmlns:wpc="http://schemas.microsoft.com/office/word/2010/wordprocessingCanvas" xmlns:cx="http://schemas.microsoft.com/office/drawing/2014/chartex" xmlns:cx1="http://schemas.microsoft.com/office/drawing/2015/9/8/chartex" xmlns:cx2="http://schemas.microsoft.com/office/drawing/2015/10/21/chartex" xmlns:cx3="http://schemas.microsoft.com/office/drawing/2016/5/9/chartex" xmlns:cx4="http://schemas.microsoft.com/office/drawing/2016/5/10/chartex" xmlns:cx5="http://schemas.microsoft.com/office/drawing/2016/5/11/chartex" xmlns:cx6="http://schemas.microsoft.com/office/drawing/2016/5/12/chartex" xmlns:cx7="http://schemas.microsoft.com/office/drawing/2016/5/13/chartex" xmlns:cx8="http://schemas.microsoft.com/office/drawing/2016/5/14/chartex" xmlns:mc="http://schemas.openxmlformats.org/markup-compatibility/2006" xmlns:aink="http://schemas.microsoft.com/office/drawing/2016/ink" xmlns:am3d="http://schemas.microsoft.com/office/drawing/2017/model3d" xmlns:o="urn:schemas-microsoft-com:office:office" xmlns:oel="http://schemas.microsoft.com/office/2019/extlst" xmlns:r="http://schemas.openxmlformats.org/officeDocument/2006/relationships" xmlns:m="http://schemas.openxmlformats.org/officeDocument/2006/math" xmlns:v="urn:schemas-microsoft-com:vml" xmlns:wp14="http://schemas.microsoft.com/office/word/2010/wordprocessingDrawing" xmlns:wp="http://schemas.openxmlformats.org/drawingml/2006/wordprocessingDrawing" xmlns:w10="urn:schemas-microsoft-com:office:word" xmlns:w="http://schemas.openxmlformats.org/wordprocessingml/2006/main" xmlns:w14="http://schemas.microsoft.com/office/word/2010/wordml" xmlns:w15="http://schemas.microsoft.com/office/word/2012/wordml" xmlns:w16cei="http://schemas.microsoft.com/office/word/2026/wordml/cei" xmlns:w16cex="http://schemas.microsoft.com/office/word/2018/wordml/cex" xmlns:w16cid="http://schemas.microsoft.com/office/word/2016/wordml/cid" xmlns:w16="http://schemas.microsoft.com/office/word/2018/wordml" xmlns:w16du="http://schemas.microsoft.com/office/word/2023/wordml/word16du" xmlns:w16sdtdh="http://schemas.microsoft.com/office/word/2020/wordml/sdtdatahash" xmlns:w16sdtfl="http://schemas.microsoft.com/office/word/2024/wordml/sdtformatlock" xmlns:w16se="http://schemas.microsoft.com/office/word/2015/wordml/symex" xmlns:wpg="http://schemas.microsoft.com/office/word/2010/wordprocessingGroup" xmlns:wpi="http://schemas.microsoft.com/office/word/2010/wordprocessingInk" xmlns:wne="http://schemas.microsoft.com/office/word/2006/wordml" xmlns:wps="http://schemas.microsoft.com/office/word/2010/wordprocessingShape" mc:Ignorable="w14 w15 w16se w16cid w16 w16cex w16sdtdh w16sdtfl w16du wp14">
+<w:hdr xmlns:wpc="http://schemas.microsoft.com/office/word/2010/wordprocessingCanvas" xmlns:cx="http://schemas.microsoft.com/office/drawing/2014/chartex" xmlns:cx1="http://schemas.microsoft.com/office/drawing/2015/9/8/chartex" xmlns:cx2="http://schemas.microsoft.com/office/drawing/2015/10/21/chartex" xmlns:cx3="http://schemas.microsoft.com/office/drawing/2016/5/9/chartex" xmlns:cx4="http://schemas.microsoft.com/office/drawing/2016/5/10/chartex" xmlns:cx5="http://schemas.microsoft.com/office/drawing/2016/5/11/chartex" xmlns:cx6="http://schemas.microsoft.com/office/drawing/2016/5/12/chartex" xmlns:cx7="http://schemas.microsoft.com/office/drawing/2016/5/13/chartex" xmlns:cx8="http://schemas.microsoft.com/office/drawing/2016/5/14/chartex" xmlns:mc="http://schemas.openxmlformats.org/markup-compatibility/2006" xmlns:aink="http://schemas.microsoft.com/office/drawing/2016/ink" xmlns:am3d="http://schemas.microsoft.com/office/drawing/2017/model3d" xmlns:o="urn:schemas-microsoft-com:office:office" xmlns:r="http://schemas.openxmlformats.org/officeDocument/2006/relationships" xmlns:m="http://schemas.openxmlformats.org/officeDocument/2006/math" xmlns:v="urn:schemas-microsoft-com:vml" xmlns:wp14="http://schemas.microsoft.com/office/word/2010/wordprocessingDrawing" xmlns:wp="http://schemas.openxmlformats.org/drawingml/2006/wordprocessingDrawing" xmlns:w10="urn:schemas-microsoft-com:office:word" xmlns:w="http://schemas.openxmlformats.org/wordprocessingml/2006/main" xmlns:w14="http://schemas.microsoft.com/office/word/2010/wordml" xmlns:w15="http://schemas.microsoft.com/office/word/2012/wordml" xmlns:w16cex="http://schemas.microsoft.com/office/word/2018/wordml/cex" xmlns:w16cid="http://schemas.microsoft.com/office/word/2016/wordml/cid" xmlns:w16="http://schemas.microsoft.com/office/word/2018/wordml" xmlns:w16sdtdh="http://schemas.microsoft.com/office/word/2020/wordml/sdtdatahash" xmlns:w16se="http://schemas.microsoft.com/office/word/2015/wordml/symex" xmlns:wpg="http://schemas.microsoft.com/office/word/2010/wordprocessingGroup" xmlns:wpi="http://schemas.microsoft.com/office/word/2010/wordprocessingInk" xmlns:wne="http://schemas.microsoft.com/office/word/2006/wordml" xmlns:wps="http://schemas.microsoft.com/office/word/2010/wordprocessingShape" mc:Ignorable="w14 w15 w16se w16cid w16 w16cex w16sdtdh wp14">
   <w:p>
     <w:pPr>
       <w:pStyle w:val="Encabezado"/>
     </w:pPr>
     <w:r>
+      <w:rPr>
+        <w:noProof/>
+      </w:rPr>
       <w:drawing>
-        <wp:inline distT="0" distB="0" distL="0" distR="0" wp14:anchorId="2F0664B8" wp14:editId="4315374E">
-          <wp:extent cx="1060373" cy="314325"/>
-          <wp:effectExtent l="0" t="0" r="6985" b="0"/>
+        <wp:anchor distT="0" distB="0" distL="114300" distR="114300" simplePos="0" relativeHeight="251658240" behindDoc="1" locked="0" layoutInCell="1" allowOverlap="1" wp14:anchorId="0AEAD46B" wp14:editId="00F91275">
+          <wp:simplePos x="0" y="0"/>
+          <wp:positionH relativeFrom="column">
+            <wp:posOffset>4807239</wp:posOffset>
+          </wp:positionH>
+          <wp:positionV relativeFrom="page">
+            <wp:posOffset>102870</wp:posOffset>
+          </wp:positionV>
+          <wp:extent cx="1503045" cy="664845"/>
+          <wp:effectExtent l="0" t="0" r="1905" b="1905"/>
+          <wp:wrapTight wrapText="bothSides">
+            <wp:wrapPolygon edited="0">
+              <wp:start x="0" y="0"/>
+              <wp:lineTo x="0" y="21043"/>
+              <wp:lineTo x="21354" y="21043"/>
+              <wp:lineTo x="21354" y="0"/>
+              <wp:lineTo x="0" y="0"/>
+            </wp:wrapPolygon>
+          </wp:wrapTight>
+          <wp:docPr id="1270516917" name="Imagen 2"/>
+          <wp:cNvGraphicFramePr>
+            <a:graphicFrameLocks xmlns:a="http://schemas.openxmlformats.org/drawingml/2006/main" noChangeAspect="1"/>
+          </wp:cNvGraphicFramePr>
+          <a:graphic xmlns:a="http://schemas.openxmlformats.org/drawingml/2006/main">
+            <a:graphicData uri="http://schemas.openxmlformats.org/drawingml/2006/picture">
+              <pic:pic xmlns:pic="http://schemas.openxmlformats.org/drawingml/2006/picture">
+                <pic:nvPicPr>
+                  <pic:cNvPr id="1270516917" name="Imagen 1270516917"/>
+                  <pic:cNvPicPr/>
+                </pic:nvPicPr>
+                <pic:blipFill>
+                  <a:blip r:embed="rId1">
+                    <a:extLst>
+                      <a:ext uri="{28A0092B-C50C-407E-A947-70E740481C1C}">
+                        <a14:useLocalDpi xmlns:a14="http://schemas.microsoft.com/office/drawing/2010/main" val="0"/>
+                      </a:ext>
+                    </a:extLst>
+                  </a:blip>
+                  <a:stretch>
+                    <a:fillRect/>
+                  </a:stretch>
+                </pic:blipFill>
+                <pic:spPr>
+                  <a:xfrm>
+                    <a:off x="0" y="0"/>
+                    <a:ext cx="1503045" cy="664845"/>
+                  </a:xfrm>
+                  <a:prstGeom prst="rect">
+                    <a:avLst/>
+                  </a:prstGeom>
+                </pic:spPr>
+              </pic:pic>
+            </a:graphicData>
+          </a:graphic>
+          <wp14:sizeRelH relativeFrom="margin">
+            <wp14:pctWidth>0</wp14:pctWidth>
+          </wp14:sizeRelH>
+          <wp14:sizeRelV relativeFrom="margin">
+            <wp14:pctHeight>0</wp14:pctHeight>
+          </wp14:sizeRelV>
+        </wp:anchor>
+      </w:drawing>
+    </w:r>
+    <w:r>
+      <w:rPr>
+        <w:noProof/>
+      </w:rPr>
+      <w:drawing>
+        <wp:anchor distT="0" distB="0" distL="114300" distR="114300" simplePos="0" relativeHeight="251659264" behindDoc="1" locked="0" layoutInCell="1" allowOverlap="1" wp14:anchorId="446F2C05" wp14:editId="557AB8D1">
+          <wp:simplePos x="0" y="0"/>
+          <wp:positionH relativeFrom="column">
+            <wp:posOffset>-720090</wp:posOffset>
+          </wp:positionH>
+          <wp:positionV relativeFrom="page">
+            <wp:posOffset>221615</wp:posOffset>
+          </wp:positionV>
+          <wp:extent cx="1648460" cy="488315"/>
+          <wp:effectExtent l="0" t="0" r="8890" b="6985"/>
+          <wp:wrapTight wrapText="bothSides">
+            <wp:wrapPolygon edited="0">
+              <wp:start x="0" y="0"/>
+              <wp:lineTo x="0" y="21066"/>
+              <wp:lineTo x="21467" y="21066"/>
+              <wp:lineTo x="21467" y="0"/>
+              <wp:lineTo x="0" y="0"/>
+            </wp:wrapPolygon>
+          </wp:wrapTight>
           <wp:docPr id="1793748712" name="Imagen 1"/>
           <wp:cNvGraphicFramePr>
             <a:graphicFrameLocks xmlns:a="http://schemas.openxmlformats.org/drawingml/2006/main" noChangeAspect="1"/>
@@ -999,49 +1299,6 @@
               <pic:pic xmlns:pic="http://schemas.openxmlformats.org/drawingml/2006/picture">
                 <pic:nvPicPr>
                   <pic:cNvPr id="1793748712" name=""/>
-                  <pic:cNvPicPr/>
-                </pic:nvPicPr>
-                <pic:blipFill>
-                  <a:blip r:embed="rId1"/>
-                  <a:stretch>
-                    <a:fillRect/>
-                  </a:stretch>
-                </pic:blipFill>
-                <pic:spPr>
-                  <a:xfrm>
-                    <a:off x="0" y="0"/>
-                    <a:ext cx="1082334" cy="320835"/>
-                  </a:xfrm>
-                  <a:prstGeom prst="rect">
-                    <a:avLst/>
-                  </a:prstGeom>
-                </pic:spPr>
-              </pic:pic>
-            </a:graphicData>
-          </a:graphic>
-        </wp:inline>
-      </w:drawing>
-    </w:r>
-    <w:r>
-      <w:t xml:space="preserve">                                                                                                                               </w:t>
-    </w:r>
-    <w:r>
-      <w:rPr>
-        <w:noProof/>
-      </w:rPr>
-      <w:drawing>
-        <wp:inline distT="0" distB="0" distL="0" distR="0" wp14:anchorId="0AEAD46B" wp14:editId="67FACF50">
-          <wp:extent cx="923925" cy="409101"/>
-          <wp:effectExtent l="0" t="0" r="0" b="0"/>
-          <wp:docPr id="1270516917" name="Imagen 2"/>
-          <wp:cNvGraphicFramePr>
-            <a:graphicFrameLocks xmlns:a="http://schemas.openxmlformats.org/drawingml/2006/main" noChangeAspect="1"/>
-          </wp:cNvGraphicFramePr>
-          <a:graphic xmlns:a="http://schemas.openxmlformats.org/drawingml/2006/main">
-            <a:graphicData uri="http://schemas.openxmlformats.org/drawingml/2006/picture">
-              <pic:pic xmlns:pic="http://schemas.openxmlformats.org/drawingml/2006/picture">
-                <pic:nvPicPr>
-                  <pic:cNvPr id="1270516917" name="Imagen 1270516917"/>
                   <pic:cNvPicPr/>
                 </pic:nvPicPr>
                 <pic:blipFill>
@@ -1059,7 +1316,7 @@
                 <pic:spPr>
                   <a:xfrm>
                     <a:off x="0" y="0"/>
-                    <a:ext cx="947625" cy="419595"/>
+                    <a:ext cx="1648460" cy="488315"/>
                   </a:xfrm>
                   <a:prstGeom prst="rect">
                     <a:avLst/>
@@ -1068,8 +1325,11 @@
               </pic:pic>
             </a:graphicData>
           </a:graphic>
-        </wp:inline>
+        </wp:anchor>
       </w:drawing>
+    </w:r>
+    <w:r>
+      <w:t xml:space="preserve">                                                                                                                               </w:t>
     </w:r>
   </w:p>
   <w:p>
@@ -1081,7 +1341,7 @@
 </file>
 
 <file path=word/numbering.xml><?xml version="1.0" encoding="utf-8"?>
-<w:numbering xmlns:wpc="http://schemas.microsoft.com/office/word/2010/wordprocessingCanvas" xmlns:cx="http://schemas.microsoft.com/office/drawing/2014/chartex" xmlns:cx1="http://schemas.microsoft.com/office/drawing/2015/9/8/chartex" xmlns:cx2="http://schemas.microsoft.com/office/drawing/2015/10/21/chartex" xmlns:cx3="http://schemas.microsoft.com/office/drawing/2016/5/9/chartex" xmlns:cx4="http://schemas.microsoft.com/office/drawing/2016/5/10/chartex" xmlns:cx5="http://schemas.microsoft.com/office/drawing/2016/5/11/chartex" xmlns:cx6="http://schemas.microsoft.com/office/drawing/2016/5/12/chartex" xmlns:cx7="http://schemas.microsoft.com/office/drawing/2016/5/13/chartex" xmlns:cx8="http://schemas.microsoft.com/office/drawing/2016/5/14/chartex" xmlns:mc="http://schemas.openxmlformats.org/markup-compatibility/2006" xmlns:aink="http://schemas.microsoft.com/office/drawing/2016/ink" xmlns:am3d="http://schemas.microsoft.com/office/drawing/2017/model3d" xmlns:o="urn:schemas-microsoft-com:office:office" xmlns:oel="http://schemas.microsoft.com/office/2019/extlst" xmlns:r="http://schemas.openxmlformats.org/officeDocument/2006/relationships" xmlns:m="http://schemas.openxmlformats.org/officeDocument/2006/math" xmlns:v="urn:schemas-microsoft-com:vml" xmlns:wp14="http://schemas.microsoft.com/office/word/2010/wordprocessingDrawing" xmlns:wp="http://schemas.openxmlformats.org/drawingml/2006/wordprocessingDrawing" xmlns:w10="urn:schemas-microsoft-com:office:word" xmlns:w="http://schemas.openxmlformats.org/wordprocessingml/2006/main" xmlns:w14="http://schemas.microsoft.com/office/word/2010/wordml" xmlns:w15="http://schemas.microsoft.com/office/word/2012/wordml" xmlns:w16cei="http://schemas.microsoft.com/office/word/2026/wordml/cei" xmlns:w16cex="http://schemas.microsoft.com/office/word/2018/wordml/cex" xmlns:w16cid="http://schemas.microsoft.com/office/word/2016/wordml/cid" xmlns:w16="http://schemas.microsoft.com/office/word/2018/wordml" xmlns:w16du="http://schemas.microsoft.com/office/word/2023/wordml/word16du" xmlns:w16sdtdh="http://schemas.microsoft.com/office/word/2020/wordml/sdtdatahash" xmlns:w16sdtfl="http://schemas.microsoft.com/office/word/2024/wordml/sdtformatlock" xmlns:w16se="http://schemas.microsoft.com/office/word/2015/wordml/symex" xmlns:wpg="http://schemas.microsoft.com/office/word/2010/wordprocessingGroup" xmlns:wpi="http://schemas.microsoft.com/office/word/2010/wordprocessingInk" xmlns:wne="http://schemas.microsoft.com/office/word/2006/wordml" xmlns:wps="http://schemas.microsoft.com/office/word/2010/wordprocessingShape" mc:Ignorable="w14 w15 w16se w16cid w16 w16cex w16sdtdh w16sdtfl w16du wp14">
+<w:numbering xmlns:wpc="http://schemas.microsoft.com/office/word/2010/wordprocessingCanvas" xmlns:cx="http://schemas.microsoft.com/office/drawing/2014/chartex" xmlns:cx1="http://schemas.microsoft.com/office/drawing/2015/9/8/chartex" xmlns:cx2="http://schemas.microsoft.com/office/drawing/2015/10/21/chartex" xmlns:cx3="http://schemas.microsoft.com/office/drawing/2016/5/9/chartex" xmlns:cx4="http://schemas.microsoft.com/office/drawing/2016/5/10/chartex" xmlns:cx5="http://schemas.microsoft.com/office/drawing/2016/5/11/chartex" xmlns:cx6="http://schemas.microsoft.com/office/drawing/2016/5/12/chartex" xmlns:cx7="http://schemas.microsoft.com/office/drawing/2016/5/13/chartex" xmlns:cx8="http://schemas.microsoft.com/office/drawing/2016/5/14/chartex" xmlns:mc="http://schemas.openxmlformats.org/markup-compatibility/2006" xmlns:aink="http://schemas.microsoft.com/office/drawing/2016/ink" xmlns:am3d="http://schemas.microsoft.com/office/drawing/2017/model3d" xmlns:o="urn:schemas-microsoft-com:office:office" xmlns:r="http://schemas.openxmlformats.org/officeDocument/2006/relationships" xmlns:m="http://schemas.openxmlformats.org/officeDocument/2006/math" xmlns:v="urn:schemas-microsoft-com:vml" xmlns:wp14="http://schemas.microsoft.com/office/word/2010/wordprocessingDrawing" xmlns:wp="http://schemas.openxmlformats.org/drawingml/2006/wordprocessingDrawing" xmlns:w10="urn:schemas-microsoft-com:office:word" xmlns:w="http://schemas.openxmlformats.org/wordprocessingml/2006/main" xmlns:w14="http://schemas.microsoft.com/office/word/2010/wordml" xmlns:w15="http://schemas.microsoft.com/office/word/2012/wordml" xmlns:w16cex="http://schemas.microsoft.com/office/word/2018/wordml/cex" xmlns:w16cid="http://schemas.microsoft.com/office/word/2016/wordml/cid" xmlns:w16="http://schemas.microsoft.com/office/word/2018/wordml" xmlns:w16sdtdh="http://schemas.microsoft.com/office/word/2020/wordml/sdtdatahash" xmlns:w16se="http://schemas.microsoft.com/office/word/2015/wordml/symex" xmlns:wpg="http://schemas.microsoft.com/office/word/2010/wordprocessingGroup" xmlns:wpi="http://schemas.microsoft.com/office/word/2010/wordprocessingInk" xmlns:wne="http://schemas.microsoft.com/office/word/2006/wordml" xmlns:wps="http://schemas.microsoft.com/office/word/2010/wordprocessingShape" mc:Ignorable="w14 w15 w16se w16cid w16 w16cex w16sdtdh wp14">
   <w:abstractNum w:abstractNumId="0" w15:restartNumberingAfterBreak="0">
     <w:nsid w:val="01FB1858"/>
     <w:multiLevelType w:val="multilevel"/>
@@ -2090,6 +2350,155 @@
     </w:lvl>
   </w:abstractNum>
   <w:abstractNum w:abstractNumId="7" w15:restartNumberingAfterBreak="0">
+    <w:nsid w:val="67CB3718"/>
+    <w:multiLevelType w:val="multilevel"/>
+    <w:tmpl w:val="C0F037B2"/>
+    <w:lvl w:ilvl="0">
+      <w:start w:val="1"/>
+      <w:numFmt w:val="bullet"/>
+      <w:lvlText w:val=""/>
+      <w:lvlJc w:val="left"/>
+      <w:pPr>
+        <w:tabs>
+          <w:tab w:val="num" w:pos="720"/>
+        </w:tabs>
+        <w:ind w:left="720" w:hanging="360"/>
+      </w:pPr>
+      <w:rPr>
+        <w:rFonts w:ascii="Symbol" w:hAnsi="Symbol" w:hint="default"/>
+        <w:sz w:val="20"/>
+      </w:rPr>
+    </w:lvl>
+    <w:lvl w:ilvl="1" w:tentative="1">
+      <w:start w:val="1"/>
+      <w:numFmt w:val="bullet"/>
+      <w:lvlText w:val="o"/>
+      <w:lvlJc w:val="left"/>
+      <w:pPr>
+        <w:tabs>
+          <w:tab w:val="num" w:pos="1440"/>
+        </w:tabs>
+        <w:ind w:left="1440" w:hanging="360"/>
+      </w:pPr>
+      <w:rPr>
+        <w:rFonts w:ascii="Courier New" w:hAnsi="Courier New" w:hint="default"/>
+        <w:sz w:val="20"/>
+      </w:rPr>
+    </w:lvl>
+    <w:lvl w:ilvl="2" w:tentative="1">
+      <w:start w:val="1"/>
+      <w:numFmt w:val="bullet"/>
+      <w:lvlText w:val=""/>
+      <w:lvlJc w:val="left"/>
+      <w:pPr>
+        <w:tabs>
+          <w:tab w:val="num" w:pos="2160"/>
+        </w:tabs>
+        <w:ind w:left="2160" w:hanging="360"/>
+      </w:pPr>
+      <w:rPr>
+        <w:rFonts w:ascii="Wingdings" w:hAnsi="Wingdings" w:hint="default"/>
+        <w:sz w:val="20"/>
+      </w:rPr>
+    </w:lvl>
+    <w:lvl w:ilvl="3" w:tentative="1">
+      <w:start w:val="1"/>
+      <w:numFmt w:val="bullet"/>
+      <w:lvlText w:val=""/>
+      <w:lvlJc w:val="left"/>
+      <w:pPr>
+        <w:tabs>
+          <w:tab w:val="num" w:pos="2880"/>
+        </w:tabs>
+        <w:ind w:left="2880" w:hanging="360"/>
+      </w:pPr>
+      <w:rPr>
+        <w:rFonts w:ascii="Wingdings" w:hAnsi="Wingdings" w:hint="default"/>
+        <w:sz w:val="20"/>
+      </w:rPr>
+    </w:lvl>
+    <w:lvl w:ilvl="4" w:tentative="1">
+      <w:start w:val="1"/>
+      <w:numFmt w:val="bullet"/>
+      <w:lvlText w:val=""/>
+      <w:lvlJc w:val="left"/>
+      <w:pPr>
+        <w:tabs>
+          <w:tab w:val="num" w:pos="3600"/>
+        </w:tabs>
+        <w:ind w:left="3600" w:hanging="360"/>
+      </w:pPr>
+      <w:rPr>
+        <w:rFonts w:ascii="Wingdings" w:hAnsi="Wingdings" w:hint="default"/>
+        <w:sz w:val="20"/>
+      </w:rPr>
+    </w:lvl>
+    <w:lvl w:ilvl="5" w:tentative="1">
+      <w:start w:val="1"/>
+      <w:numFmt w:val="bullet"/>
+      <w:lvlText w:val=""/>
+      <w:lvlJc w:val="left"/>
+      <w:pPr>
+        <w:tabs>
+          <w:tab w:val="num" w:pos="4320"/>
+        </w:tabs>
+        <w:ind w:left="4320" w:hanging="360"/>
+      </w:pPr>
+      <w:rPr>
+        <w:rFonts w:ascii="Wingdings" w:hAnsi="Wingdings" w:hint="default"/>
+        <w:sz w:val="20"/>
+      </w:rPr>
+    </w:lvl>
+    <w:lvl w:ilvl="6" w:tentative="1">
+      <w:start w:val="1"/>
+      <w:numFmt w:val="bullet"/>
+      <w:lvlText w:val=""/>
+      <w:lvlJc w:val="left"/>
+      <w:pPr>
+        <w:tabs>
+          <w:tab w:val="num" w:pos="5040"/>
+        </w:tabs>
+        <w:ind w:left="5040" w:hanging="360"/>
+      </w:pPr>
+      <w:rPr>
+        <w:rFonts w:ascii="Wingdings" w:hAnsi="Wingdings" w:hint="default"/>
+        <w:sz w:val="20"/>
+      </w:rPr>
+    </w:lvl>
+    <w:lvl w:ilvl="7" w:tentative="1">
+      <w:start w:val="1"/>
+      <w:numFmt w:val="bullet"/>
+      <w:lvlText w:val=""/>
+      <w:lvlJc w:val="left"/>
+      <w:pPr>
+        <w:tabs>
+          <w:tab w:val="num" w:pos="5760"/>
+        </w:tabs>
+        <w:ind w:left="5760" w:hanging="360"/>
+      </w:pPr>
+      <w:rPr>
+        <w:rFonts w:ascii="Wingdings" w:hAnsi="Wingdings" w:hint="default"/>
+        <w:sz w:val="20"/>
+      </w:rPr>
+    </w:lvl>
+    <w:lvl w:ilvl="8" w:tentative="1">
+      <w:start w:val="1"/>
+      <w:numFmt w:val="bullet"/>
+      <w:lvlText w:val=""/>
+      <w:lvlJc w:val="left"/>
+      <w:pPr>
+        <w:tabs>
+          <w:tab w:val="num" w:pos="6480"/>
+        </w:tabs>
+        <w:ind w:left="6480" w:hanging="360"/>
+      </w:pPr>
+      <w:rPr>
+        <w:rFonts w:ascii="Wingdings" w:hAnsi="Wingdings" w:hint="default"/>
+        <w:sz w:val="20"/>
+      </w:rPr>
+    </w:lvl>
+  </w:abstractNum>
+  <w:abstractNum w:abstractNumId="8" w15:restartNumberingAfterBreak="0">
     <w:nsid w:val="6A9074B6"/>
     <w:multiLevelType w:val="multilevel"/>
     <w:tmpl w:val="82184E84"/>
@@ -2238,7 +2647,7 @@
       </w:rPr>
     </w:lvl>
   </w:abstractNum>
-  <w:abstractNum w:abstractNumId="8" w15:restartNumberingAfterBreak="0">
+  <w:abstractNum w:abstractNumId="9" w15:restartNumberingAfterBreak="0">
     <w:nsid w:val="6A940E06"/>
     <w:multiLevelType w:val="multilevel"/>
     <w:tmpl w:val="46466A9E"/>
@@ -2387,7 +2796,7 @@
       </w:rPr>
     </w:lvl>
   </w:abstractNum>
-  <w:abstractNum w:abstractNumId="9" w15:restartNumberingAfterBreak="0">
+  <w:abstractNum w:abstractNumId="10" w15:restartNumberingAfterBreak="0">
     <w:nsid w:val="6F1F4E6A"/>
     <w:multiLevelType w:val="multilevel"/>
     <w:tmpl w:val="F53EF842"/>
@@ -2536,7 +2945,7 @@
       </w:rPr>
     </w:lvl>
   </w:abstractNum>
-  <w:abstractNum w:abstractNumId="10" w15:restartNumberingAfterBreak="0">
+  <w:abstractNum w:abstractNumId="11" w15:restartNumberingAfterBreak="0">
     <w:nsid w:val="748B4D25"/>
     <w:multiLevelType w:val="multilevel"/>
     <w:tmpl w:val="73F270A4"/>
@@ -2649,7 +3058,7 @@
       </w:pPr>
     </w:lvl>
   </w:abstractNum>
-  <w:abstractNum w:abstractNumId="11" w15:restartNumberingAfterBreak="0">
+  <w:abstractNum w:abstractNumId="12" w15:restartNumberingAfterBreak="0">
     <w:nsid w:val="7C8679AA"/>
     <w:multiLevelType w:val="multilevel"/>
     <w:tmpl w:val="6C9C25AE"/>
@@ -2798,47 +3207,50 @@
       </w:rPr>
     </w:lvl>
   </w:abstractNum>
-  <w:num w:numId="1" w16cid:durableId="1420978539">
+  <w:num w:numId="1">
+    <w:abstractNumId w:val="9"/>
+  </w:num>
+  <w:num w:numId="2">
     <w:abstractNumId w:val="8"/>
   </w:num>
-  <w:num w:numId="2" w16cid:durableId="1517887996">
-    <w:abstractNumId w:val="7"/>
+  <w:num w:numId="3">
+    <w:abstractNumId w:val="11"/>
   </w:num>
-  <w:num w:numId="3" w16cid:durableId="1354843190">
+  <w:num w:numId="4">
+    <w:abstractNumId w:val="0"/>
+  </w:num>
+  <w:num w:numId="5">
+    <w:abstractNumId w:val="4"/>
+  </w:num>
+  <w:num w:numId="6">
+    <w:abstractNumId w:val="5"/>
+  </w:num>
+  <w:num w:numId="7">
     <w:abstractNumId w:val="10"/>
   </w:num>
-  <w:num w:numId="4" w16cid:durableId="1478759196">
-    <w:abstractNumId w:val="0"/>
-  </w:num>
-  <w:num w:numId="5" w16cid:durableId="444809168">
-    <w:abstractNumId w:val="4"/>
-  </w:num>
-  <w:num w:numId="6" w16cid:durableId="336272695">
-    <w:abstractNumId w:val="5"/>
-  </w:num>
-  <w:num w:numId="7" w16cid:durableId="1379547561">
-    <w:abstractNumId w:val="9"/>
-  </w:num>
-  <w:num w:numId="8" w16cid:durableId="476722976">
+  <w:num w:numId="8">
     <w:abstractNumId w:val="6"/>
   </w:num>
-  <w:num w:numId="9" w16cid:durableId="1083650861">
+  <w:num w:numId="9">
     <w:abstractNumId w:val="1"/>
   </w:num>
-  <w:num w:numId="10" w16cid:durableId="17432766">
-    <w:abstractNumId w:val="11"/>
+  <w:num w:numId="10">
+    <w:abstractNumId w:val="12"/>
   </w:num>
-  <w:num w:numId="11" w16cid:durableId="275134970">
+  <w:num w:numId="11">
     <w:abstractNumId w:val="2"/>
   </w:num>
-  <w:num w:numId="12" w16cid:durableId="1026636394">
+  <w:num w:numId="12">
     <w:abstractNumId w:val="3"/>
+  </w:num>
+  <w:num w:numId="13">
+    <w:abstractNumId w:val="7"/>
   </w:num>
 </w:numbering>
 </file>
 
 <file path=word/styles.xml><?xml version="1.0" encoding="utf-8"?>
-<w:styles xmlns:mc="http://schemas.openxmlformats.org/markup-compatibility/2006" xmlns:r="http://schemas.openxmlformats.org/officeDocument/2006/relationships" xmlns:w="http://schemas.openxmlformats.org/wordprocessingml/2006/main" xmlns:w14="http://schemas.microsoft.com/office/word/2010/wordml" xmlns:w15="http://schemas.microsoft.com/office/word/2012/wordml" xmlns:w16cex="http://schemas.microsoft.com/office/word/2018/wordml/cex" xmlns:w16cid="http://schemas.microsoft.com/office/word/2016/wordml/cid" xmlns:w16="http://schemas.microsoft.com/office/word/2018/wordml" xmlns:w16du="http://schemas.microsoft.com/office/word/2023/wordml/word16du" xmlns:w16sdtdh="http://schemas.microsoft.com/office/word/2020/wordml/sdtdatahash" xmlns:w16sdtfl="http://schemas.microsoft.com/office/word/2024/wordml/sdtformatlock" xmlns:w16se="http://schemas.microsoft.com/office/word/2015/wordml/symex" mc:Ignorable="w14 w15 w16se w16cid w16 w16cex w16sdtdh w16sdtfl w16du">
+<w:styles xmlns:mc="http://schemas.openxmlformats.org/markup-compatibility/2006" xmlns:r="http://schemas.openxmlformats.org/officeDocument/2006/relationships" xmlns:w="http://schemas.openxmlformats.org/wordprocessingml/2006/main" xmlns:w14="http://schemas.microsoft.com/office/word/2010/wordml" xmlns:w15="http://schemas.microsoft.com/office/word/2012/wordml" xmlns:w16cex="http://schemas.microsoft.com/office/word/2018/wordml/cex" xmlns:w16cid="http://schemas.microsoft.com/office/word/2016/wordml/cid" xmlns:w16="http://schemas.microsoft.com/office/word/2018/wordml" xmlns:w16sdtdh="http://schemas.microsoft.com/office/word/2020/wordml/sdtdatahash" xmlns:w16se="http://schemas.microsoft.com/office/word/2015/wordml/symex" mc:Ignorable="w14 w15 w16se w16cid w16 w16cex w16sdtdh">
   <w:docDefaults>
     <w:rPrDefault>
       <w:rPr>
@@ -3840,6 +4252,22 @@
       </w:tblBorders>
     </w:tblPr>
   </w:style>
+  <w:style w:type="paragraph" w:customStyle="1" w:styleId="font-claude-response-body">
+    <w:name w:val="font-claude-response-body"/>
+    <w:basedOn w:val="Normal"/>
+    <w:rsid w:val="00841C61"/>
+    <w:pPr>
+      <w:spacing w:before="100" w:beforeAutospacing="1" w:after="100" w:afterAutospacing="1" w:line="240" w:lineRule="auto"/>
+    </w:pPr>
+    <w:rPr>
+      <w:rFonts w:ascii="Times New Roman" w:eastAsia="Times New Roman" w:hAnsi="Times New Roman" w:cs="Times New Roman"/>
+      <w:kern w:val="0"/>
+      <w:sz w:val="24"/>
+      <w:szCs w:val="24"/>
+      <w:lang w:eastAsia="es-CR"/>
+      <w14:ligatures w14:val="none"/>
+    </w:rPr>
+  </w:style>
 </w:styles>
 </file>
 

</xml_diff>

<commit_message>
Actualiza documentacion de seguimiento, bitacora dia 3 y plan de tareas pendientes (dias 4-10)
</commit_message>
<xml_diff>
--- a/docs/Jeiron-Bitacora.docx
+++ b/docs/Jeiron-Bitacora.docx
@@ -207,30 +207,14 @@
           </w:tcPr>
           <w:p>
             <w:r>
-              <w:t>Repaso de en qué consiste el proyecto</w:t>
-            </w:r>
-            <w:r>
-              <w:t xml:space="preserve">. </w:t>
+              <w:t xml:space="preserve">Repaso de en qué consiste el proyecto. </w:t>
             </w:r>
           </w:p>
           <w:p/>
           <w:p>
             <w:r>
-              <w:t xml:space="preserve">Revisión del </w:t>
+              <w:t>Revisión del stack de herramientas y software a utilizar (Claude, Render, GitHub, Phyton</w:t>
             </w:r>
-            <w:proofErr w:type="spellStart"/>
-            <w:r>
-              <w:t>stack</w:t>
-            </w:r>
-            <w:proofErr w:type="spellEnd"/>
-            <w:r>
-              <w:t xml:space="preserve"> de herramientas y software a utilizar (Claude, Render, GitHub, </w:t>
-            </w:r>
-            <w:proofErr w:type="spellStart"/>
-            <w:r>
-              <w:t>Phyton</w:t>
-            </w:r>
-            <w:proofErr w:type="spellEnd"/>
           </w:p>
           <w:p/>
           <w:p>
@@ -247,43 +231,14 @@
           <w:p/>
           <w:p>
             <w:r>
-              <w:t xml:space="preserve">Repaso de cómo se hace con Claude como coordinador, para hacer </w:t>
+              <w:t>Repaso de cómo se hace con Claude como coordinador, para hacer scrapping del sitio WEB real de la Municipalidad usando Selenium y generación de un clone del mismo además del chatbot</w:t>
             </w:r>
-            <w:proofErr w:type="spellStart"/>
-            <w:r>
-              <w:t>scrapping</w:t>
-            </w:r>
-            <w:proofErr w:type="spellEnd"/>
-            <w:r>
-              <w:t xml:space="preserve"> del sitio WEB real de la Municipalidad usando </w:t>
-            </w:r>
-            <w:proofErr w:type="spellStart"/>
-            <w:r>
-              <w:t>Selenium</w:t>
-            </w:r>
-            <w:proofErr w:type="spellEnd"/>
-            <w:r>
-              <w:t xml:space="preserve"> y generación de un clone del mismo además del </w:t>
-            </w:r>
-            <w:proofErr w:type="spellStart"/>
-            <w:r>
-              <w:t>chatbo</w:t>
-            </w:r>
-            <w:r>
-              <w:t>t</w:t>
-            </w:r>
-            <w:proofErr w:type="spellEnd"/>
           </w:p>
           <w:p/>
           <w:p>
             <w:r>
-              <w:t xml:space="preserve">Repaso de la configuración en Render para hacer el despliegue del APP y las páginas en GitHub </w:t>
+              <w:t>Repaso de la configuración en Render para hacer el despliegue del APP y las páginas en GitHub pages</w:t>
             </w:r>
-            <w:proofErr w:type="spellStart"/>
-            <w:r>
-              <w:t>pages</w:t>
-            </w:r>
-            <w:proofErr w:type="spellEnd"/>
           </w:p>
           <w:p>
             <w:r>
@@ -318,10 +273,7 @@
           </w:tcPr>
           <w:p>
             <w:r>
-              <w:t>4</w:t>
-            </w:r>
-            <w:r>
-              <w:t>/8/26</w:t>
+              <w:t>4/8/26</w:t>
             </w:r>
           </w:p>
         </w:tc>
@@ -380,42 +332,7 @@
                 <w:lang w:eastAsia="en-US"/>
                 <w14:ligatures w14:val="standardContextual"/>
               </w:rPr>
-              <w:t xml:space="preserve">Se subieron 3 </w:t>
-            </w:r>
-            <w:proofErr w:type="spellStart"/>
-            <w:r>
-              <w:rPr>
-                <w:rFonts w:asciiTheme="minorHAnsi" w:eastAsiaTheme="minorHAnsi" w:hAnsiTheme="minorHAnsi" w:cstheme="minorBidi"/>
-                <w:kern w:val="2"/>
-                <w:sz w:val="22"/>
-                <w:szCs w:val="22"/>
-                <w:lang w:eastAsia="en-US"/>
-                <w14:ligatures w14:val="standardContextual"/>
-              </w:rPr>
-              <w:t>PDFs</w:t>
-            </w:r>
-            <w:proofErr w:type="spellEnd"/>
-            <w:r>
-              <w:rPr>
-                <w:rFonts w:asciiTheme="minorHAnsi" w:eastAsiaTheme="minorHAnsi" w:hAnsiTheme="minorHAnsi" w:cstheme="minorBidi"/>
-                <w:kern w:val="2"/>
-                <w:sz w:val="22"/>
-                <w:szCs w:val="22"/>
-                <w:lang w:eastAsia="en-US"/>
-                <w14:ligatures w14:val="standardContextual"/>
-              </w:rPr>
-              <w:t xml:space="preserve"> propios al repositorio (Mapa de Zonificación, Amnistía Tributaria, Plan de Desarrollo Humano Local), reemplazando enlaces frágiles a Dropbox.</w:t>
-            </w:r>
-            <w:r>
-              <w:rPr>
-                <w:rFonts w:asciiTheme="minorHAnsi" w:eastAsiaTheme="minorHAnsi" w:hAnsiTheme="minorHAnsi" w:cstheme="minorBidi"/>
-                <w:kern w:val="2"/>
-                <w:sz w:val="22"/>
-                <w:szCs w:val="22"/>
-                <w:lang w:eastAsia="en-US"/>
-                <w14:ligatures w14:val="standardContextual"/>
-              </w:rPr>
-              <w:t xml:space="preserve"> </w:t>
+              <w:t xml:space="preserve">Se subieron 3 PDFs propios al repositorio (Mapa de Zonificación, Amnistía Tributaria, Plan de Desarrollo Humano Local), reemplazando enlaces frágiles a Dropbox. </w:t>
             </w:r>
           </w:p>
           <w:p>
@@ -488,31 +405,7 @@
                 <w:lang w:eastAsia="en-US"/>
                 <w14:ligatures w14:val="standardContextual"/>
               </w:rPr>
-              <w:t xml:space="preserve">Se corrigió el mensaje de páginas "externas": ahora distingue entre páginas que sí son del sitio real de la Municipalidad y sistemas realmente ajenos (CFIA, Google </w:t>
-            </w:r>
-            <w:proofErr w:type="spellStart"/>
-            <w:r>
-              <w:rPr>
-                <w:rFonts w:asciiTheme="minorHAnsi" w:eastAsiaTheme="minorHAnsi" w:hAnsiTheme="minorHAnsi" w:cstheme="minorBidi"/>
-                <w:kern w:val="2"/>
-                <w:sz w:val="22"/>
-                <w:szCs w:val="22"/>
-                <w:lang w:eastAsia="en-US"/>
-                <w14:ligatures w14:val="standardContextual"/>
-              </w:rPr>
-              <w:t>Maps</w:t>
-            </w:r>
-            <w:proofErr w:type="spellEnd"/>
-            <w:r>
-              <w:rPr>
-                <w:rFonts w:asciiTheme="minorHAnsi" w:eastAsiaTheme="minorHAnsi" w:hAnsiTheme="minorHAnsi" w:cstheme="minorBidi"/>
-                <w:kern w:val="2"/>
-                <w:sz w:val="22"/>
-                <w:szCs w:val="22"/>
-                <w:lang w:eastAsia="en-US"/>
-                <w14:ligatures w14:val="standardContextual"/>
-              </w:rPr>
-              <w:t>, Contraloría).</w:t>
+              <w:t>Se corrigió el mensaje de páginas "externas": ahora distingue entre páginas que sí son del sitio real de la Municipalidad y sistemas realmente ajenos (CFIA, Google Maps, Contraloría).</w:t>
             </w:r>
           </w:p>
           <w:p>
@@ -573,10 +466,7 @@
           <w:p>
             <w:r>
               <w:lastRenderedPageBreak/>
-              <w:t>5</w:t>
-            </w:r>
-            <w:r>
-              <w:t>/8/26</w:t>
+              <w:t>5/8/26</w:t>
             </w:r>
           </w:p>
         </w:tc>
@@ -614,7 +504,161 @@
           <w:tcPr>
             <w:tcW w:w="5125" w:type="dxa"/>
           </w:tcPr>
-          <w:p/>
+          <w:p>
+            <w:pPr>
+              <w:pStyle w:val="font-claude-response-body"/>
+              <w:rPr>
+                <w:rFonts w:asciiTheme="minorHAnsi" w:eastAsiaTheme="minorHAnsi" w:hAnsiTheme="minorHAnsi" w:cstheme="minorBidi"/>
+                <w:kern w:val="2"/>
+                <w:sz w:val="22"/>
+                <w:szCs w:val="22"/>
+                <w:lang w:eastAsia="en-US"/>
+                <w14:ligatures w14:val="standardContextual"/>
+              </w:rPr>
+            </w:pPr>
+            <w:r>
+              <w:rPr>
+                <w:rFonts w:asciiTheme="minorHAnsi" w:eastAsiaTheme="minorHAnsi" w:hAnsiTheme="minorHAnsi" w:cstheme="minorBidi"/>
+                <w:kern w:val="2"/>
+                <w:sz w:val="22"/>
+                <w:szCs w:val="22"/>
+                <w:lang w:eastAsia="en-US"/>
+                <w14:ligatures w14:val="standardContextual"/>
+              </w:rPr>
+              <w:t>Cierre de “Noticias y Comunicados”: estaba roto (el tipo de nodo nunca se había implementado), se armó con las 6 categorías reales del blog institucional (Sin categoría, Cantón de Flores, Municipalidad, Comunicados, Gestión Ambiental, Leyes), 21 publicaciones curadas y verificadas una por una contra flores.go.cr.</w:t>
+            </w:r>
+          </w:p>
+          <w:p>
+            <w:pPr>
+              <w:pStyle w:val="font-claude-response-body"/>
+              <w:rPr>
+                <w:rFonts w:asciiTheme="minorHAnsi" w:eastAsiaTheme="minorHAnsi" w:hAnsiTheme="minorHAnsi" w:cstheme="minorBidi"/>
+                <w:kern w:val="2"/>
+                <w:sz w:val="22"/>
+                <w:szCs w:val="22"/>
+                <w:lang w:eastAsia="en-US"/>
+                <w14:ligatures w14:val="standardContextual"/>
+              </w:rPr>
+            </w:pPr>
+            <w:r>
+              <w:rPr>
+                <w:rFonts w:asciiTheme="minorHAnsi" w:eastAsiaTheme="minorHAnsi" w:hAnsiTheme="minorHAnsi" w:cstheme="minorBidi"/>
+                <w:kern w:val="2"/>
+                <w:sz w:val="22"/>
+                <w:szCs w:val="22"/>
+                <w:lang w:eastAsia="en-US"/>
+                <w14:ligatures w14:val="standardContextual"/>
+              </w:rPr>
+              <w:t>Corrección de mapa_organizado.md: se detectaron y corrigieron varias advertencias desactualizadas (enlaces marcados como rotos que ya se habían resuelto en sesiones anteriores, y una sección de “Transparencia” que describía una arquitectura de submenú que ya no existe en el prototipo).</w:t>
+            </w:r>
+          </w:p>
+          <w:p>
+            <w:pPr>
+              <w:pStyle w:val="font-claude-response-body"/>
+              <w:rPr>
+                <w:rFonts w:asciiTheme="minorHAnsi" w:eastAsiaTheme="minorHAnsi" w:hAnsiTheme="minorHAnsi" w:cstheme="minorBidi"/>
+                <w:kern w:val="2"/>
+                <w:sz w:val="22"/>
+                <w:szCs w:val="22"/>
+                <w:lang w:eastAsia="en-US"/>
+                <w14:ligatures w14:val="standardContextual"/>
+              </w:rPr>
+            </w:pPr>
+            <w:r>
+              <w:rPr>
+                <w:rFonts w:asciiTheme="minorHAnsi" w:eastAsiaTheme="minorHAnsi" w:hAnsiTheme="minorHAnsi" w:cstheme="minorBidi"/>
+                <w:kern w:val="2"/>
+                <w:sz w:val="22"/>
+                <w:szCs w:val="22"/>
+                <w:lang w:eastAsia="en-US"/>
+                <w14:ligatures w14:val="standardContextual"/>
+              </w:rPr>
+              <w:t>Cierre de “Contáctenos”: se amplió el Directorio Institucional de 8 a 53 contactos reales (cargo, nombre, extensión, correo) más 7 líneas directas adicionales, se agregó un buscador, y se documentaron dos inconsistencias propias del sitio real (correos cruzados entre dos filas).</w:t>
+            </w:r>
+          </w:p>
+          <w:p>
+            <w:pPr>
+              <w:pStyle w:val="font-claude-response-body"/>
+              <w:rPr>
+                <w:rFonts w:asciiTheme="minorHAnsi" w:eastAsiaTheme="minorHAnsi" w:hAnsiTheme="minorHAnsi" w:cstheme="minorBidi"/>
+                <w:kern w:val="2"/>
+                <w:sz w:val="22"/>
+                <w:szCs w:val="22"/>
+                <w:lang w:eastAsia="en-US"/>
+                <w14:ligatures w14:val="standardContextual"/>
+              </w:rPr>
+            </w:pPr>
+            <w:r>
+              <w:rPr>
+                <w:rFonts w:asciiTheme="minorHAnsi" w:eastAsiaTheme="minorHAnsi" w:hAnsiTheme="minorHAnsi" w:cstheme="minorBidi"/>
+                <w:kern w:val="2"/>
+                <w:sz w:val="22"/>
+                <w:szCs w:val="22"/>
+                <w:lang w:eastAsia="en-US"/>
+                <w14:ligatures w14:val="standardContextual"/>
+              </w:rPr>
+              <w:t>Con el cierre de Noticias y Contáctenos, las 4 secciones del menú principal del sitio real (Municipalidad, Contribuyente, Noticias y Comunicados, Contáctenos) quedan revisadas nodo por nodo contra flores.go.cr.</w:t>
+            </w:r>
+          </w:p>
+          <w:p>
+            <w:pPr>
+              <w:pStyle w:val="font-claude-response-body"/>
+              <w:rPr>
+                <w:rFonts w:asciiTheme="minorHAnsi" w:eastAsiaTheme="minorHAnsi" w:hAnsiTheme="minorHAnsi" w:cstheme="minorBidi"/>
+                <w:kern w:val="2"/>
+                <w:sz w:val="22"/>
+                <w:szCs w:val="22"/>
+                <w:lang w:eastAsia="en-US"/>
+                <w14:ligatures w14:val="standardContextual"/>
+              </w:rPr>
+            </w:pPr>
+            <w:r>
+              <w:rPr>
+                <w:rFonts w:asciiTheme="minorHAnsi" w:eastAsiaTheme="minorHAnsi" w:hAnsiTheme="minorHAnsi" w:cstheme="minorBidi"/>
+                <w:kern w:val="2"/>
+                <w:sz w:val="22"/>
+                <w:szCs w:val="22"/>
+                <w:lang w:eastAsia="en-US"/>
+                <w14:ligatures w14:val="standardContextual"/>
+              </w:rPr>
+              <w:t>Coordinación de la entrega del prototipo por GitHub para revisión</w:t>
+            </w:r>
+            <w:r>
+              <w:rPr>
+                <w:rFonts w:asciiTheme="minorHAnsi" w:eastAsiaTheme="minorHAnsi" w:hAnsiTheme="minorHAnsi" w:cstheme="minorBidi"/>
+                <w:kern w:val="2"/>
+                <w:sz w:val="22"/>
+                <w:szCs w:val="22"/>
+                <w:lang w:eastAsia="en-US"/>
+                <w14:ligatures w14:val="standardContextual"/>
+              </w:rPr>
+              <w:t xml:space="preserve"> del tutor</w:t>
+            </w:r>
+            <w:r>
+              <w:rPr>
+                <w:rFonts w:asciiTheme="minorHAnsi" w:eastAsiaTheme="minorHAnsi" w:hAnsiTheme="minorHAnsi" w:cstheme="minorBidi"/>
+                <w:kern w:val="2"/>
+                <w:sz w:val="22"/>
+                <w:szCs w:val="22"/>
+                <w:lang w:eastAsia="en-US"/>
+                <w14:ligatures w14:val="standardContextual"/>
+              </w:rPr>
+              <w:t>, incluyendo el rediseño visual experimental (index_prueba.html), publicado en GitHub Pages para comparación directa.</w:t>
+            </w:r>
+          </w:p>
+          <w:p>
+            <w:pPr>
+              <w:pStyle w:val="font-claude-response-body"/>
+              <w:rPr>
+                <w:rFonts w:asciiTheme="minorHAnsi" w:eastAsiaTheme="minorHAnsi" w:hAnsiTheme="minorHAnsi" w:cstheme="minorBidi"/>
+                <w:kern w:val="2"/>
+                <w:sz w:val="22"/>
+                <w:szCs w:val="22"/>
+                <w:lang w:eastAsia="en-US"/>
+                <w14:ligatures w14:val="standardContextual"/>
+              </w:rPr>
+            </w:pPr>
+          </w:p>
         </w:tc>
       </w:tr>
       <w:tr>

</xml_diff>

<commit_message>
Simplificar entrada del 6/8/26 en la bitacora
</commit_message>
<xml_diff>
--- a/docs/Jeiron-Bitacora.docx
+++ b/docs/Jeiron-Bitacora.docx
@@ -621,29 +621,7 @@
                 <w:lang w:eastAsia="en-US"/>
                 <w14:ligatures w14:val="standardContextual"/>
               </w:rPr>
-              <w:t>Coordinación de la entrega del prototipo por GitHub para revisión</w:t>
-            </w:r>
-            <w:r>
-              <w:rPr>
-                <w:rFonts w:asciiTheme="minorHAnsi" w:eastAsiaTheme="minorHAnsi" w:hAnsiTheme="minorHAnsi" w:cstheme="minorBidi"/>
-                <w:kern w:val="2"/>
-                <w:sz w:val="22"/>
-                <w:szCs w:val="22"/>
-                <w:lang w:eastAsia="en-US"/>
-                <w14:ligatures w14:val="standardContextual"/>
-              </w:rPr>
-              <w:t xml:space="preserve"> del tutor</w:t>
-            </w:r>
-            <w:r>
-              <w:rPr>
-                <w:rFonts w:asciiTheme="minorHAnsi" w:eastAsiaTheme="minorHAnsi" w:hAnsiTheme="minorHAnsi" w:cstheme="minorBidi"/>
-                <w:kern w:val="2"/>
-                <w:sz w:val="22"/>
-                <w:szCs w:val="22"/>
-                <w:lang w:eastAsia="en-US"/>
-                <w14:ligatures w14:val="standardContextual"/>
-              </w:rPr>
-              <w:t>, incluyendo el rediseño visual experimental (index_prueba.html), publicado en GitHub Pages para comparación directa.</w:t>
+              <w:t xml:space="preserve">Coordinación de la entrega del prototipo por GitHub para revisión del tutor, incluyendo el rediseño visual experimental (index_prueba.html), publicado en GitHub Pages para comparación directa.</w:t>
             </w:r>
           </w:p>
           <w:p>
@@ -666,7 +644,11 @@
           <w:tcPr>
             <w:tcW w:w="913" w:type="dxa"/>
           </w:tcPr>
-          <w:p/>
+          <w:p>
+            <w:r>
+              <w:t>6/8/26</w:t>
+            </w:r>
+          </w:p>
         </w:tc>
         <w:tc>
           <w:tcPr>
@@ -690,7 +672,126 @@
           <w:tcPr>
             <w:tcW w:w="5125" w:type="dxa"/>
           </w:tcPr>
-          <w:p/>
+          <w:p>
+            <w:pPr>
+              <w:pStyle w:val="font-claude-response-body"/>
+              <w:rPr>
+                <w:rFonts w:asciiTheme="minorHAnsi" w:eastAsiaTheme="minorHAnsi" w:hAnsiTheme="minorHAnsi" w:cstheme="minorBidi"/>
+                <w:kern w:val="2"/>
+                <w:sz w:val="22"/>
+                <w:szCs w:val="22"/>
+                <w:lang w:eastAsia="en-US"/>
+                <w14:ligatures w14:val="standardContextual"/>
+              </w:rPr>
+            </w:pPr>
+            <w:r>
+              <w:rPr>
+                <w:rFonts w:asciiTheme="minorHAnsi" w:eastAsiaTheme="minorHAnsi" w:hAnsiTheme="minorHAnsi" w:cstheme="minorBidi"/>
+                <w:kern w:val="2"/>
+                <w:sz w:val="22"/>
+                <w:szCs w:val="22"/>
+                <w:lang w:eastAsia="en-US"/>
+                <w14:ligatures w14:val="standardContextual"/>
+              </w:rPr>
+              <w:t xml:space="preserve">Se mejoró el sistema de respuestas del chatbot: en vez de enviarle todos los documentos en cada mensaje, ahora busca solo la información relevante (más rápido y económico), y se activó una búsqueda en internet como respaldo para preguntas fuera del contenido cargado. Se agregaron 5 temas nuevos investigados a mano (rankings municipales, manejo de residuos, fuentes de agua, zonificación y pago en línea).</w:t>
+            </w:r>
+          </w:p>
+          <w:p>
+            <w:pPr>
+              <w:pStyle w:val="font-claude-response-body"/>
+              <w:rPr>
+                <w:rFonts w:asciiTheme="minorHAnsi" w:eastAsiaTheme="minorHAnsi" w:hAnsiTheme="minorHAnsi" w:cstheme="minorBidi"/>
+                <w:kern w:val="2"/>
+                <w:sz w:val="22"/>
+                <w:szCs w:val="22"/>
+                <w:lang w:eastAsia="en-US"/>
+                <w14:ligatures w14:val="standardContextual"/>
+              </w:rPr>
+            </w:pPr>
+            <w:r>
+              <w:rPr>
+                <w:rFonts w:asciiTheme="minorHAnsi" w:eastAsiaTheme="minorHAnsi" w:hAnsiTheme="minorHAnsi" w:cstheme="minorBidi"/>
+                <w:kern w:val="2"/>
+                <w:sz w:val="22"/>
+                <w:szCs w:val="22"/>
+                <w:lang w:eastAsia="en-US"/>
+                <w14:ligatures w14:val="standardContextual"/>
+              </w:rPr>
+              <w:t xml:space="preserve">Se encontraron y corrigieron 3 errores reales del chatbot ya en producción: uno que rompía todo el chat, respuestas que salían incompletas, y consultas que se cortaban por tardar demasiado en responder. Los tres se probaron localmente antes de subir la corrección. También se mejoró la presentación del chat: el texto en negrita ahora se ve bien, las respuestas son más breves, y se corrigieron los links largos que se salían del cuadro.</w:t>
+            </w:r>
+          </w:p>
+          <w:p>
+            <w:pPr>
+              <w:pStyle w:val="font-claude-response-body"/>
+              <w:rPr>
+                <w:rFonts w:asciiTheme="minorHAnsi" w:eastAsiaTheme="minorHAnsi" w:hAnsiTheme="minorHAnsi" w:cstheme="minorBidi"/>
+                <w:kern w:val="2"/>
+                <w:sz w:val="22"/>
+                <w:szCs w:val="22"/>
+                <w:lang w:eastAsia="en-US"/>
+                <w14:ligatures w14:val="standardContextual"/>
+              </w:rPr>
+            </w:pPr>
+            <w:r>
+              <w:rPr>
+                <w:rFonts w:asciiTheme="minorHAnsi" w:eastAsiaTheme="minorHAnsi" w:hAnsiTheme="minorHAnsi" w:cstheme="minorBidi"/>
+                <w:kern w:val="2"/>
+                <w:sz w:val="22"/>
+                <w:szCs w:val="22"/>
+                <w:lang w:eastAsia="en-US"/>
+                <w14:ligatures w14:val="standardContextual"/>
+              </w:rPr>
+              <w:t xml:space="preserve">Día 4 del plan: se agregó “Planos por APC” al menú, se corrigió la tabla de Salarios Base 2021 (no se mostraba correctamente), se resolvieron los 8 pendientes de mapa_organizado.md, y se agregó “Formularios de patentes” como nodo nuevo.</w:t>
+            </w:r>
+          </w:p>
+          <w:p>
+            <w:pPr>
+              <w:pStyle w:val="font-claude-response-body"/>
+              <w:rPr>
+                <w:rFonts w:asciiTheme="minorHAnsi" w:eastAsiaTheme="minorHAnsi" w:hAnsiTheme="minorHAnsi" w:cstheme="minorBidi"/>
+                <w:kern w:val="2"/>
+                <w:sz w:val="22"/>
+                <w:szCs w:val="22"/>
+                <w:lang w:eastAsia="en-US"/>
+                <w14:ligatures w14:val="standardContextual"/>
+              </w:rPr>
+            </w:pPr>
+            <w:r>
+              <w:rPr>
+                <w:rFonts w:asciiTheme="minorHAnsi" w:eastAsiaTheme="minorHAnsi" w:hAnsiTheme="minorHAnsi" w:cstheme="minorBidi"/>
+                <w:kern w:val="2"/>
+                <w:sz w:val="22"/>
+                <w:szCs w:val="22"/>
+                <w:lang w:eastAsia="en-US"/>
+                <w14:ligatures w14:val="standardContextual"/>
+              </w:rPr>
+              <w:t xml:space="preserve">Fuera del plan original, a pedido de Gerardo: se agregó la sección “Medios de pago” (BCR, Banco Nacional y Pago directo) en Pago en línea. También se corrigió “Preguntas Frecuentes”, que no funcionaba bien en ninguno de los dos prototipos.</w:t>
+            </w:r>
+          </w:p>
+          <w:p>
+            <w:pPr>
+              <w:pStyle w:val="font-claude-response-body"/>
+              <w:rPr>
+                <w:rFonts w:asciiTheme="minorHAnsi" w:eastAsiaTheme="minorHAnsi" w:hAnsiTheme="minorHAnsi" w:cstheme="minorBidi"/>
+                <w:kern w:val="2"/>
+                <w:sz w:val="22"/>
+                <w:szCs w:val="22"/>
+                <w:lang w:eastAsia="en-US"/>
+                <w14:ligatures w14:val="standardContextual"/>
+              </w:rPr>
+            </w:pPr>
+            <w:r>
+              <w:rPr>
+                <w:rFonts w:asciiTheme="minorHAnsi" w:eastAsiaTheme="minorHAnsi" w:hAnsiTheme="minorHAnsi" w:cstheme="minorBidi"/>
+                <w:kern w:val="2"/>
+                <w:sz w:val="22"/>
+                <w:szCs w:val="22"/>
+                <w:lang w:eastAsia="en-US"/>
+                <w14:ligatures w14:val="standardContextual"/>
+              </w:rPr>
+              <w:t xml:space="preserve">Todos los cambios se aplicaron por igual en index.html e index_prueba.html, y se probaron con capturas de pantalla del navegador antes de entregar cada uno.</w:t>
+            </w:r>
+          </w:p>
         </w:tc>
       </w:tr>
       <w:tr>

</xml_diff>

<commit_message>
Dia 5: QA funcional completo, paridad index/index_prueba, SINPE Movil, icono WhatsApp, fondo hero index_prueba
</commit_message>
<xml_diff>
--- a/docs/Jeiron-Bitacora.docx
+++ b/docs/Jeiron-Bitacora.docx
@@ -655,19 +655,31 @@
           <w:tcPr>
             <w:tcW w:w="1074" w:type="dxa"/>
           </w:tcPr>
-          <w:p/>
+          <w:p>
+            <w:r>
+              <w:t>08 AM</w:t>
+            </w:r>
+          </w:p>
         </w:tc>
         <w:tc>
           <w:tcPr>
             <w:tcW w:w="904" w:type="dxa"/>
           </w:tcPr>
-          <w:p/>
+          <w:p>
+            <w:r>
+              <w:t>5PM</w:t>
+            </w:r>
+          </w:p>
         </w:tc>
         <w:tc>
           <w:tcPr>
             <w:tcW w:w="812" w:type="dxa"/>
           </w:tcPr>
-          <w:p/>
+          <w:p>
+            <w:r>
+              <w:t>8</w:t>
+            </w:r>
+          </w:p>
         </w:tc>
         <w:tc>
           <w:tcPr>
@@ -718,18 +730,7 @@
                 <w:lang w:eastAsia="en-US"/>
                 <w14:ligatures w14:val="standardContextual"/>
               </w:rPr>
-              <w:t>, se creó un RAG</w:t>
-            </w:r>
-            <w:r>
-              <w:rPr>
-                <w:rFonts w:asciiTheme="minorHAnsi" w:eastAsiaTheme="minorHAnsi" w:hAnsiTheme="minorHAnsi" w:cstheme="minorBidi"/>
-                <w:kern w:val="2"/>
-                <w:sz w:val="22"/>
-                <w:szCs w:val="22"/>
-                <w:lang w:eastAsia="en-US"/>
-                <w14:ligatures w14:val="standardContextual"/>
-              </w:rPr>
-              <w:t>: en vez de enviarle todos los documentos en cada mensaje, ahora busca solo la información relevante (más rápido y económico), y se activó una búsqueda en internet como respaldo para preguntas fuera del contenido cargado. Se agregaron 5 temas nuevos investigados a mano (rankings municipales, manejo de residuos, fuentes de agua, zonificación y pago en línea).</w:t>
+              <w:t>, se creó un RAG: en vez de enviarle todos los documentos en cada mensaje, ahora busca solo la información relevante (más rápido y económico), y se activó una búsqueda en internet como respaldo para preguntas fuera del contenido cargado. Se agregaron 5 temas nuevos investigados a mano (rankings municipales, manejo de residuos, fuentes de agua, zonificación y pago en línea).</w:t>
             </w:r>
           </w:p>
           <w:p>
@@ -777,18 +778,7 @@
                 <w:lang w:eastAsia="en-US"/>
                 <w14:ligatures w14:val="standardContextual"/>
               </w:rPr>
-              <w:t xml:space="preserve">Se </w:t>
-            </w:r>
-            <w:r>
-              <w:rPr>
-                <w:rFonts w:asciiTheme="minorHAnsi" w:eastAsiaTheme="minorHAnsi" w:hAnsiTheme="minorHAnsi" w:cstheme="minorBidi"/>
-                <w:kern w:val="2"/>
-                <w:sz w:val="22"/>
-                <w:szCs w:val="22"/>
-                <w:lang w:eastAsia="en-US"/>
-                <w14:ligatures w14:val="standardContextual"/>
-              </w:rPr>
-              <w:t>agregó “Planos por APC” al menú, se corrigió la tabla de Salarios Base 2021 (no se mostraba correctamente), se resolvieron los 8 pendientes de mapa_organizado.md, y se agregó “Formularios de patentes” como nodo nuevo.</w:t>
+              <w:t>Se agregó “Planos por APC” al menú, se corrigió la tabla de Salarios Base 2021 (no se mostraba correctamente), se resolvieron los 8 pendientes de mapa_organizado.md, y se agregó “Formularios de patentes” como nodo nuevo.</w:t>
             </w:r>
           </w:p>
           <w:p>
@@ -812,18 +802,7 @@
                 <w:lang w:eastAsia="en-US"/>
                 <w14:ligatures w14:val="standardContextual"/>
               </w:rPr>
-              <w:t xml:space="preserve">Se </w:t>
-            </w:r>
-            <w:r>
-              <w:rPr>
-                <w:rFonts w:asciiTheme="minorHAnsi" w:eastAsiaTheme="minorHAnsi" w:hAnsiTheme="minorHAnsi" w:cstheme="minorBidi"/>
-                <w:kern w:val="2"/>
-                <w:sz w:val="22"/>
-                <w:szCs w:val="22"/>
-                <w:lang w:eastAsia="en-US"/>
-                <w14:ligatures w14:val="standardContextual"/>
-              </w:rPr>
-              <w:t>agregó la sección “Medios de pago” (BCR, Banco Nacional y Pago directo) en Pago en línea. También se corrigió “Preguntas Frecuentes”, que no funcionaba bien en ninguno de los dos prototipos.</w:t>
+              <w:t>Se agregó la sección “Medios de pago” (BCR, Banco Nacional y Pago directo) en Pago en línea. También se corrigió “Preguntas Frecuentes”, que no funcionaba bien en ninguno de los dos prototipos.</w:t>
             </w:r>
           </w:p>
         </w:tc>
@@ -833,31 +812,75 @@
           <w:tcPr>
             <w:tcW w:w="913" w:type="dxa"/>
           </w:tcPr>
-          <w:p/>
+          <w:p>
+            <w:r>
+              <w:t>7/8/26</w:t>
+            </w:r>
+          </w:p>
         </w:tc>
         <w:tc>
           <w:tcPr>
             <w:tcW w:w="1074" w:type="dxa"/>
           </w:tcPr>
-          <w:p/>
+          <w:p>
+            <w:r>
+              <w:t>08 AM</w:t>
+            </w:r>
+          </w:p>
         </w:tc>
         <w:tc>
           <w:tcPr>
             <w:tcW w:w="904" w:type="dxa"/>
           </w:tcPr>
-          <w:p/>
+          <w:p>
+            <w:r>
+              <w:t>5PM</w:t>
+            </w:r>
+          </w:p>
         </w:tc>
         <w:tc>
           <w:tcPr>
             <w:tcW w:w="812" w:type="dxa"/>
           </w:tcPr>
-          <w:p/>
+          <w:p>
+            <w:r>
+              <w:t>8</w:t>
+            </w:r>
+          </w:p>
         </w:tc>
         <w:tc>
           <w:tcPr>
             <w:tcW w:w="5125" w:type="dxa"/>
           </w:tcPr>
-          <w:p/>
+          <w:p>
+            <w:r>
+              <w:t>Control de calidad funcional de todos los nodos de Municipalidad y Contribuyente en ambos prototipos, probados automáticamente en navegador (0 errores reales) y luego verificados a mano en un segundo navegador (Edge), sin problemas.</w:t>
+            </w:r>
+          </w:p>
+          <w:p>
+            <w:r>
+              <w:t>Se encontró y corrigió una diferencia real de contenido entre index.html e index_prueba.html (un mecanismo que evita títulos repetidos y un nuevo tipo de nodo para mostrar imágenes grandes, como el Mapa de Zonificación), dejando ambos archivos alineados en contenido; la única diferencia que queda entre ellos es la estética.</w:t>
+            </w:r>
+          </w:p>
+          <w:p>
+            <w:r>
+              <w:t>Se confirmó contra el sitio real que los plazos, la multa y los requisitos de la Declaración Jurada del Impuesto de Patentes 2026 que muestra el prototipo siguen vigentes.</w:t>
+            </w:r>
+          </w:p>
+          <w:p>
+            <w:r>
+              <w:t xml:space="preserve">Se agregó la opción “Pago por SINPE Móvil” en Medios de pago, replicando el formulario real (nombre y </w:t>
+            </w:r>
+            <w:r>
+              <w:lastRenderedPageBreak/>
+              <w:t>cédula del contribuyente) que redirige a WhatsApp con un mensaje preparado al número oficial de Cobros de la Municipalidad. Se corrigió también el ícono y el color del botón de WhatsApp para que coincidan con el logo real.</w:t>
+            </w:r>
+          </w:p>
+          <w:p>
+            <w:r>
+              <w:t>Se reemplazó la imagen de fondo de baja calidad en index_prueba.html por una foto en alta resolución de la iglesia de San Joaquín de Flores.</w:t>
+            </w:r>
+          </w:p>
         </w:tc>
       </w:tr>
       <w:tr>
@@ -1382,7 +1405,7 @@
         <w:noProof/>
       </w:rPr>
       <w:drawing>
-        <wp:anchor distT="0" distB="0" distL="114300" distR="114300" simplePos="0" relativeHeight="251658240" behindDoc="1" locked="0" layoutInCell="1" allowOverlap="1" wp14:anchorId="0AEAD46B" wp14:editId="00F91275">
+        <wp:anchor distT="0" distB="0" distL="114300" distR="114300" simplePos="0" relativeHeight="251658240" behindDoc="1" locked="0" layoutInCell="1" allowOverlap="1" wp14:anchorId="6367AEB1" wp14:editId="1BA5A9B3">
           <wp:simplePos x="0" y="0"/>
           <wp:positionH relativeFrom="column">
             <wp:posOffset>4807239</wp:posOffset>
@@ -1450,7 +1473,7 @@
         <w:noProof/>
       </w:rPr>
       <w:drawing>
-        <wp:anchor distT="0" distB="0" distL="114300" distR="114300" simplePos="0" relativeHeight="251659264" behindDoc="1" locked="0" layoutInCell="1" allowOverlap="1" wp14:anchorId="446F2C05" wp14:editId="557AB8D1">
+        <wp:anchor distT="0" distB="0" distL="114300" distR="114300" simplePos="0" relativeHeight="251659264" behindDoc="1" locked="0" layoutInCell="1" allowOverlap="1" wp14:anchorId="3D6BF2FF" wp14:editId="7155F89A">
           <wp:simplePos x="0" y="0"/>
           <wp:positionH relativeFrom="column">
             <wp:posOffset>-720090</wp:posOffset>

</xml_diff>